<commit_message>
refactor: reorganización de servicios y estructura del proyecto
</commit_message>
<xml_diff>
--- a/Proyecto.docx
+++ b/Proyecto.docx
@@ -14,23 +14,7 @@
           <w:b/>
           <w:bCs/>
         </w:rPr>
-        <w:t xml:space="preserve">Proyecto: </w:t>
-      </w:r>
-      <w:proofErr w:type="spellStart"/>
-      <w:r>
-        <w:rPr>
-          <w:b/>
-          <w:bCs/>
-        </w:rPr>
-        <w:t>SecureVault</w:t>
-      </w:r>
-      <w:proofErr w:type="spellEnd"/>
-      <w:r>
-        <w:rPr>
-          <w:b/>
-          <w:bCs/>
-        </w:rPr>
-        <w:t xml:space="preserve"> API</w:t>
+        <w:t>Proyecto: SecureVault API</w:t>
       </w:r>
     </w:p>
     <w:p>
@@ -50,7 +34,35 @@
           <w:b/>
           <w:bCs/>
         </w:rPr>
-        <w:t>¿Por qué es perfecto para tu materia?</w:t>
+        <w:t xml:space="preserve">¿Por qué </w:t>
+      </w:r>
+      <w:r>
+        <w:rPr>
+          <w:b/>
+          <w:bCs/>
+        </w:rPr>
+        <w:t>se selecciona</w:t>
+      </w:r>
+      <w:r>
+        <w:rPr>
+          <w:b/>
+          <w:bCs/>
+        </w:rPr>
+        <w:t xml:space="preserve"> para </w:t>
+      </w:r>
+      <w:r>
+        <w:rPr>
+          <w:b/>
+          <w:bCs/>
+        </w:rPr>
+        <w:t>la</w:t>
+      </w:r>
+      <w:r>
+        <w:rPr>
+          <w:b/>
+          <w:bCs/>
+        </w:rPr>
+        <w:t xml:space="preserve"> materia?</w:t>
       </w:r>
     </w:p>
     <w:p>
@@ -68,55 +80,7 @@
         <w:t>Ciberseguridad</w:t>
       </w:r>
       <w:r>
-        <w:t xml:space="preserve">: Encriptación AES-256 en reposo, JWT + OAuth2 para </w:t>
-      </w:r>
-      <w:proofErr w:type="spellStart"/>
-      <w:r>
-        <w:t>auth</w:t>
-      </w:r>
-      <w:proofErr w:type="spellEnd"/>
-      <w:r>
-        <w:t xml:space="preserve">, validación de inputs (OWASP), </w:t>
-      </w:r>
-      <w:proofErr w:type="spellStart"/>
-      <w:r>
-        <w:t>rate-limiting</w:t>
-      </w:r>
-      <w:proofErr w:type="spellEnd"/>
-      <w:r>
-        <w:t xml:space="preserve">, </w:t>
-      </w:r>
-      <w:proofErr w:type="spellStart"/>
-      <w:r>
-        <w:t>logging</w:t>
-      </w:r>
-      <w:proofErr w:type="spellEnd"/>
-      <w:r>
-        <w:t xml:space="preserve"> de auditoría, </w:t>
-      </w:r>
-      <w:proofErr w:type="spellStart"/>
-      <w:r>
-        <w:t>secrets</w:t>
-      </w:r>
-      <w:proofErr w:type="spellEnd"/>
-      <w:r>
-        <w:t xml:space="preserve"> </w:t>
-      </w:r>
-      <w:proofErr w:type="spellStart"/>
-      <w:r>
-        <w:t>management</w:t>
-      </w:r>
-      <w:proofErr w:type="spellEnd"/>
-      <w:r>
-        <w:t xml:space="preserve"> (no </w:t>
-      </w:r>
-      <w:proofErr w:type="spellStart"/>
-      <w:r>
-        <w:t>hardcodeados</w:t>
-      </w:r>
-      <w:proofErr w:type="spellEnd"/>
-      <w:r>
-        <w:t>), HTTPS/TLS.</w:t>
+        <w:t>: Encriptación AES-256 en reposo, JWT + OAuth2 para auth, validación de inputs (OWASP), rate-limiting, logging de auditoría, secrets management (no hardcodeados), HTTPS/TLS.</w:t>
       </w:r>
     </w:p>
     <w:p>
@@ -134,23 +98,7 @@
         <w:t>Cloud Security</w:t>
       </w:r>
       <w:r>
-        <w:t xml:space="preserve">: Simula un entorno </w:t>
-      </w:r>
-      <w:proofErr w:type="spellStart"/>
-      <w:r>
-        <w:t>cloud</w:t>
-      </w:r>
-      <w:proofErr w:type="spellEnd"/>
-      <w:r>
-        <w:t xml:space="preserve"> con variables de entorno (Docker </w:t>
-      </w:r>
-      <w:proofErr w:type="spellStart"/>
-      <w:r>
-        <w:t>secrets</w:t>
-      </w:r>
-      <w:proofErr w:type="spellEnd"/>
-      <w:r>
-        <w:t>), políticas de IAM básicas y encriptación de datos.</w:t>
+        <w:t>: Simula un entorno cloud con variables de entorno (Docker secrets), políticas de IAM básicas y encriptación de datos.</w:t>
       </w:r>
     </w:p>
     <w:p>
@@ -168,55 +116,7 @@
         <w:t>DevOps</w:t>
       </w:r>
       <w:r>
-        <w:t xml:space="preserve">: Docker + Docker </w:t>
-      </w:r>
-      <w:proofErr w:type="spellStart"/>
-      <w:r>
-        <w:t>Compose</w:t>
-      </w:r>
-      <w:proofErr w:type="spellEnd"/>
-      <w:r>
-        <w:t xml:space="preserve"> (</w:t>
-      </w:r>
-      <w:proofErr w:type="spellStart"/>
-      <w:r>
-        <w:t>multi-contenedor</w:t>
-      </w:r>
-      <w:proofErr w:type="spellEnd"/>
-      <w:r>
-        <w:t xml:space="preserve">), CI/CD básico con GitHub </w:t>
-      </w:r>
-      <w:proofErr w:type="spellStart"/>
-      <w:r>
-        <w:t>Actions</w:t>
-      </w:r>
-      <w:proofErr w:type="spellEnd"/>
-      <w:r>
-        <w:t xml:space="preserve">, </w:t>
-      </w:r>
-      <w:proofErr w:type="spellStart"/>
-      <w:r>
-        <w:t>Dockerfile</w:t>
-      </w:r>
-      <w:proofErr w:type="spellEnd"/>
-      <w:r>
-        <w:t xml:space="preserve"> optimizados, .</w:t>
-      </w:r>
-      <w:proofErr w:type="spellStart"/>
-      <w:r>
-        <w:t>dockerignore</w:t>
-      </w:r>
-      <w:proofErr w:type="spellEnd"/>
-      <w:r>
-        <w:t xml:space="preserve">, </w:t>
-      </w:r>
-      <w:proofErr w:type="spellStart"/>
-      <w:r>
-        <w:t>healthchecks</w:t>
-      </w:r>
-      <w:proofErr w:type="spellEnd"/>
-      <w:r>
-        <w:t>.</w:t>
+        <w:t>: Docker + Docker Compose (multi-contenedor), CI/CD básico con GitHub Actions, Dockerfile optimizados, .dockerignore, healthchecks.</w:t>
       </w:r>
     </w:p>
     <w:p>
@@ -252,15 +152,7 @@
         <w:t>Funcional y publicable</w:t>
       </w:r>
       <w:r>
-        <w:t xml:space="preserve">: API REST consumible por cualquier </w:t>
-      </w:r>
-      <w:proofErr w:type="spellStart"/>
-      <w:r>
-        <w:t>frontend</w:t>
-      </w:r>
-      <w:proofErr w:type="spellEnd"/>
-      <w:r>
-        <w:t>/Postman, se publica en Docker Hub y se corre con un solo comando.</w:t>
+        <w:t>: API REST consumible por cualquier frontend/Postman, se publica en Docker Hub y se corre con un solo comando.</w:t>
       </w:r>
     </w:p>
     <w:p>
@@ -278,30 +170,22 @@
         <w:t>Sencillo y rápido</w:t>
       </w:r>
       <w:r>
-        <w:t>: Todo en Python (</w:t>
-      </w:r>
-      <w:proofErr w:type="spellStart"/>
-      <w:r>
-        <w:t>FastAPI</w:t>
-      </w:r>
-      <w:proofErr w:type="spellEnd"/>
-      <w:r>
-        <w:t>) o Node.js (Express) – elige lo que ya domines. Base de datos ligera (SQLite o PostgreSQL).</w:t>
-      </w:r>
-    </w:p>
-    <w:p>
-      <w:pPr>
-        <w:rPr>
-          <w:b/>
-          <w:bCs/>
-        </w:rPr>
-      </w:pPr>
-      <w:r>
-        <w:rPr>
-          <w:b/>
-          <w:bCs/>
-        </w:rPr>
-        <w:t>Arquitectura (muy simple – solo 2 microservicios)</w:t>
+        <w:t>: Todo en Python (FastAPI) o Node.js (Express) – elige lo que ya domines. Base de datos ligera (SQLite o PostgreSQL).</w:t>
+      </w:r>
+    </w:p>
+    <w:p>
+      <w:pPr>
+        <w:rPr>
+          <w:b/>
+          <w:bCs/>
+        </w:rPr>
+      </w:pPr>
+      <w:r>
+        <w:rPr>
+          <w:b/>
+          <w:bCs/>
+        </w:rPr>
+        <w:t>Arquitectura (muy simple )</w:t>
       </w:r>
     </w:p>
     <w:p>
@@ -352,15 +236,7 @@
         </w:numPr>
       </w:pPr>
       <w:r>
-        <w:t xml:space="preserve">Protege los </w:t>
-      </w:r>
-      <w:proofErr w:type="spellStart"/>
-      <w:r>
-        <w:t>endpoints</w:t>
-      </w:r>
-      <w:proofErr w:type="spellEnd"/>
-      <w:r>
-        <w:t xml:space="preserve"> del Vault</w:t>
+        <w:t>Protege los endpoints del Vault</w:t>
       </w:r>
     </w:p>
     <w:p>
@@ -389,23 +265,7 @@
         </w:numPr>
       </w:pPr>
       <w:r>
-        <w:t>CRUD de secretos (</w:t>
-      </w:r>
-      <w:proofErr w:type="spellStart"/>
-      <w:r>
-        <w:t>username</w:t>
-      </w:r>
-      <w:proofErr w:type="spellEnd"/>
-      <w:r>
-        <w:t>/</w:t>
-      </w:r>
-      <w:proofErr w:type="spellStart"/>
-      <w:r>
-        <w:t>password</w:t>
-      </w:r>
-      <w:proofErr w:type="spellEnd"/>
-      <w:r>
-        <w:t>/notas)</w:t>
+        <w:t>CRUD de secretos (username/password/notas)</w:t>
       </w:r>
     </w:p>
     <w:p>
@@ -427,76 +287,22 @@
         </w:numPr>
       </w:pPr>
       <w:r>
-        <w:t xml:space="preserve">Rate </w:t>
-      </w:r>
-      <w:proofErr w:type="spellStart"/>
-      <w:r>
-        <w:t>limit</w:t>
-      </w:r>
-      <w:proofErr w:type="spellEnd"/>
-      <w:r>
-        <w:t xml:space="preserve"> + auditoría</w:t>
-      </w:r>
-    </w:p>
-    <w:p>
-      <w:proofErr w:type="spellStart"/>
-      <w:r>
-        <w:t>Frontend</w:t>
-      </w:r>
-      <w:proofErr w:type="spellEnd"/>
-      <w:r>
-        <w:t xml:space="preserve"> opcional: una página HTML simple con </w:t>
-      </w:r>
-      <w:proofErr w:type="spellStart"/>
-      <w:r>
-        <w:t>fetch</w:t>
-      </w:r>
-      <w:proofErr w:type="spellEnd"/>
-      <w:r>
-        <w:t xml:space="preserve"> (o usa Swagger de </w:t>
-      </w:r>
-      <w:proofErr w:type="spellStart"/>
-      <w:r>
-        <w:t>FastAPI</w:t>
-      </w:r>
-      <w:proofErr w:type="spellEnd"/>
-      <w:r>
-        <w:t xml:space="preserve">). Todo orquestado con </w:t>
-      </w:r>
-      <w:r>
-        <w:rPr>
-          <w:b/>
-          <w:bCs/>
-        </w:rPr>
-        <w:t xml:space="preserve">Docker </w:t>
-      </w:r>
-      <w:proofErr w:type="spellStart"/>
-      <w:r>
-        <w:rPr>
-          <w:b/>
-          <w:bCs/>
-        </w:rPr>
-        <w:t>Compose</w:t>
-      </w:r>
-      <w:proofErr w:type="spellEnd"/>
-      <w:r>
-        <w:t xml:space="preserve"> (app + </w:t>
-      </w:r>
-      <w:proofErr w:type="spellStart"/>
-      <w:r>
-        <w:t>db</w:t>
-      </w:r>
-      <w:proofErr w:type="spellEnd"/>
-      <w:r>
-        <w:t xml:space="preserve"> + opcional Redis para </w:t>
-      </w:r>
-      <w:proofErr w:type="spellStart"/>
-      <w:r>
-        <w:t>rate-limit</w:t>
-      </w:r>
-      <w:proofErr w:type="spellEnd"/>
-      <w:r>
-        <w:t>).</w:t>
+        <w:t>Rate limit + auditoría</w:t>
+      </w:r>
+    </w:p>
+    <w:p>
+      <w:r>
+        <w:t xml:space="preserve">Frontend opcional: una página HTML simple con fetch (o usa Swagger de FastAPI). Todo orquestado con </w:t>
+      </w:r>
+      <w:r>
+        <w:rPr>
+          <w:b/>
+          <w:bCs/>
+        </w:rPr>
+        <w:t>Docker Compose</w:t>
+      </w:r>
+      <w:r>
+        <w:t xml:space="preserve"> (app + db + opcional Redis para rate-limit).</w:t>
       </w:r>
     </w:p>
     <w:p>
@@ -537,49 +343,7 @@
         <w:rPr>
           <w:lang w:val="en-US"/>
         </w:rPr>
-        <w:t xml:space="preserve">Python + </w:t>
-      </w:r>
-      <w:proofErr w:type="spellStart"/>
-      <w:r>
-        <w:rPr>
-          <w:lang w:val="en-US"/>
-        </w:rPr>
-        <w:t>FastAPI</w:t>
-      </w:r>
-      <w:proofErr w:type="spellEnd"/>
-      <w:r>
-        <w:rPr>
-          <w:lang w:val="en-US"/>
-        </w:rPr>
-        <w:t xml:space="preserve"> + </w:t>
-      </w:r>
-      <w:proofErr w:type="spellStart"/>
-      <w:r>
-        <w:rPr>
-          <w:lang w:val="en-US"/>
-        </w:rPr>
-        <w:t>Pydantic</w:t>
-      </w:r>
-      <w:proofErr w:type="spellEnd"/>
-      <w:r>
-        <w:rPr>
-          <w:lang w:val="en-US"/>
-        </w:rPr>
-        <w:t xml:space="preserve"> + JWT (</w:t>
-      </w:r>
-      <w:proofErr w:type="spellStart"/>
-      <w:r>
-        <w:rPr>
-          <w:lang w:val="en-US"/>
-        </w:rPr>
-        <w:t>PyJWT</w:t>
-      </w:r>
-      <w:proofErr w:type="spellEnd"/>
-      <w:r>
-        <w:rPr>
-          <w:lang w:val="en-US"/>
-        </w:rPr>
-        <w:t>)</w:t>
+        <w:t>Python + FastAPI + Pydantic + JWT (PyJWT)</w:t>
       </w:r>
     </w:p>
     <w:p>
@@ -589,21 +353,8 @@
           <w:numId w:val="3"/>
         </w:numPr>
       </w:pPr>
-      <w:proofErr w:type="spellStart"/>
-      <w:r>
-        <w:t>SQLAlchemy</w:t>
-      </w:r>
-      <w:proofErr w:type="spellEnd"/>
-      <w:r>
-        <w:t xml:space="preserve"> + </w:t>
-      </w:r>
-      <w:proofErr w:type="spellStart"/>
-      <w:r>
-        <w:t>Alembic</w:t>
-      </w:r>
-      <w:proofErr w:type="spellEnd"/>
-      <w:r>
-        <w:t xml:space="preserve"> (migraciones)</w:t>
+      <w:r>
+        <w:t>SQLAlchemy + Alembic (migraciones)</w:t>
       </w:r>
     </w:p>
     <w:p>
@@ -613,13 +364,8 @@
           <w:numId w:val="3"/>
         </w:numPr>
       </w:pPr>
-      <w:proofErr w:type="spellStart"/>
-      <w:r>
-        <w:t>Cryptography</w:t>
-      </w:r>
-      <w:proofErr w:type="spellEnd"/>
-      <w:r>
-        <w:t xml:space="preserve"> (AES-GCM)</w:t>
+      <w:r>
+        <w:t>Cryptography (AES-GCM)</w:t>
       </w:r>
     </w:p>
     <w:p>
@@ -642,13 +388,8 @@
         </w:numPr>
       </w:pPr>
       <w:r>
-        <w:t xml:space="preserve">Docker + Docker </w:t>
-      </w:r>
-      <w:proofErr w:type="spellStart"/>
-      <w:r>
-        <w:t>Compose</w:t>
-      </w:r>
-      <w:proofErr w:type="spellEnd"/>
+        <w:t>Docker + Docker Compose</w:t>
+      </w:r>
     </w:p>
     <w:p>
       <w:pPr>
@@ -684,13 +425,8 @@
         </w:numPr>
       </w:pPr>
       <w:r>
-        <w:t xml:space="preserve">Node.js + Express + </w:t>
-      </w:r>
-      <w:proofErr w:type="spellStart"/>
-      <w:r>
-        <w:t>TypeScript</w:t>
-      </w:r>
-      <w:proofErr w:type="spellEnd"/>
+        <w:t>Node.js + Express + TypeScript</w:t>
+      </w:r>
     </w:p>
     <w:p>
       <w:pPr>
@@ -710,21 +446,8 @@
           <w:numId w:val="4"/>
         </w:numPr>
       </w:pPr>
-      <w:proofErr w:type="spellStart"/>
-      <w:r>
-        <w:t>jsonwebtoken</w:t>
-      </w:r>
-      <w:proofErr w:type="spellEnd"/>
-      <w:r>
-        <w:t xml:space="preserve"> + </w:t>
-      </w:r>
-      <w:proofErr w:type="spellStart"/>
-      <w:r>
-        <w:t>crypto</w:t>
-      </w:r>
-      <w:proofErr w:type="spellEnd"/>
-      <w:r>
-        <w:t xml:space="preserve"> (Node)</w:t>
+      <w:r>
+        <w:t>jsonwebtoken + crypto (Node)</w:t>
       </w:r>
     </w:p>
     <w:p>
@@ -760,21 +483,8 @@
           <w:numId w:val="5"/>
         </w:numPr>
       </w:pPr>
-      <w:proofErr w:type="spellStart"/>
-      <w:r>
-        <w:t>Tests</w:t>
-      </w:r>
-      <w:proofErr w:type="spellEnd"/>
-      <w:r>
-        <w:t xml:space="preserve"> unitarios (</w:t>
-      </w:r>
-      <w:proofErr w:type="spellStart"/>
-      <w:r>
-        <w:t>pytest</w:t>
-      </w:r>
-      <w:proofErr w:type="spellEnd"/>
-      <w:r>
-        <w:t xml:space="preserve"> o Jest)</w:t>
+      <w:r>
+        <w:t>Tests unitarios (pytest o Jest)</w:t>
       </w:r>
     </w:p>
     <w:p>
@@ -787,19 +497,50 @@
           <w:lang w:val="en-US"/>
         </w:rPr>
       </w:pPr>
-      <w:proofErr w:type="spellStart"/>
       <w:r>
         <w:rPr>
           <w:lang w:val="en-US"/>
         </w:rPr>
-        <w:t>Dockerfiles</w:t>
-      </w:r>
-      <w:proofErr w:type="spellEnd"/>
-      <w:r>
+        <w:t>Dockerfiles multi-stage (imagen &lt; 100 MB)</w:t>
+      </w:r>
+    </w:p>
+    <w:p>
+      <w:pPr>
+        <w:numPr>
+          <w:ilvl w:val="0"/>
+          <w:numId w:val="5"/>
+        </w:numPr>
+      </w:pPr>
+      <w:r>
+        <w:t>.env.example + docker secrets</w:t>
+      </w:r>
+    </w:p>
+    <w:p>
+      <w:pPr>
+        <w:numPr>
+          <w:ilvl w:val="0"/>
+          <w:numId w:val="5"/>
+        </w:numPr>
+      </w:pPr>
+      <w:r>
+        <w:t>Swagger/OpenAPI documentación automática</w:t>
+      </w:r>
+    </w:p>
+    <w:p>
+      <w:pPr>
+        <w:numPr>
+          <w:ilvl w:val="0"/>
+          <w:numId w:val="5"/>
+        </w:numPr>
         <w:rPr>
           <w:lang w:val="en-US"/>
         </w:rPr>
-        <w:t xml:space="preserve"> multi-stage (imagen &lt; 100 MB)</w:t>
+      </w:pPr>
+      <w:r>
+        <w:rPr>
+          <w:lang w:val="en-US"/>
+        </w:rPr>
+        <w:t>CI/CD básico (test + lint + build)</w:t>
       </w:r>
     </w:p>
     <w:p>
@@ -810,103 +551,8 @@
         </w:numPr>
       </w:pPr>
       <w:r>
-        <w:t>.</w:t>
-      </w:r>
-      <w:proofErr w:type="spellStart"/>
-      <w:r>
-        <w:t>env.example</w:t>
-      </w:r>
-      <w:proofErr w:type="spellEnd"/>
-      <w:r>
-        <w:t xml:space="preserve"> + </w:t>
-      </w:r>
-      <w:proofErr w:type="spellStart"/>
-      <w:r>
-        <w:t>docker</w:t>
-      </w:r>
-      <w:proofErr w:type="spellEnd"/>
-      <w:r>
-        <w:t xml:space="preserve"> </w:t>
-      </w:r>
-      <w:proofErr w:type="spellStart"/>
-      <w:r>
-        <w:t>secrets</w:t>
-      </w:r>
-      <w:proofErr w:type="spellEnd"/>
-    </w:p>
-    <w:p>
-      <w:pPr>
-        <w:numPr>
-          <w:ilvl w:val="0"/>
-          <w:numId w:val="5"/>
-        </w:numPr>
-      </w:pPr>
-      <w:r>
-        <w:t>Swagger/</w:t>
-      </w:r>
-      <w:proofErr w:type="spellStart"/>
-      <w:r>
-        <w:t>OpenAPI</w:t>
-      </w:r>
-      <w:proofErr w:type="spellEnd"/>
-      <w:r>
-        <w:t xml:space="preserve"> documentación automática</w:t>
-      </w:r>
-    </w:p>
-    <w:p>
-      <w:pPr>
-        <w:numPr>
-          <w:ilvl w:val="0"/>
-          <w:numId w:val="5"/>
-        </w:numPr>
-        <w:rPr>
-          <w:lang w:val="en-US"/>
-        </w:rPr>
-      </w:pPr>
-      <w:r>
-        <w:rPr>
-          <w:lang w:val="en-US"/>
-        </w:rPr>
-        <w:t xml:space="preserve">CI/CD </w:t>
-      </w:r>
-      <w:proofErr w:type="spellStart"/>
-      <w:r>
-        <w:rPr>
-          <w:lang w:val="en-US"/>
-        </w:rPr>
-        <w:t>básico</w:t>
-      </w:r>
-      <w:proofErr w:type="spellEnd"/>
-      <w:r>
-        <w:rPr>
-          <w:lang w:val="en-US"/>
-        </w:rPr>
-        <w:t xml:space="preserve"> (test + lint + build)</w:t>
-      </w:r>
-    </w:p>
-    <w:p>
-      <w:pPr>
-        <w:numPr>
-          <w:ilvl w:val="0"/>
-          <w:numId w:val="5"/>
-        </w:numPr>
-      </w:pPr>
-      <w:r>
-        <w:t xml:space="preserve">Logs estructurados + </w:t>
-      </w:r>
-      <w:proofErr w:type="spellStart"/>
-      <w:r>
-        <w:t>healthcheck</w:t>
-      </w:r>
-      <w:proofErr w:type="spellEnd"/>
-      <w:r>
-        <w:t xml:space="preserve"> </w:t>
-      </w:r>
-      <w:proofErr w:type="spellStart"/>
-      <w:r>
-        <w:t>endpoints</w:t>
-      </w:r>
-      <w:proofErr w:type="spellEnd"/>
+        <w:t>Logs estructurados + healthcheck endpoints</w:t>
+      </w:r>
     </w:p>
     <w:p/>
     <w:p/>
@@ -1243,21 +889,8 @@
             <w:hideMark/>
           </w:tcPr>
           <w:p>
-            <w:proofErr w:type="spellStart"/>
-            <w:r>
-              <w:t>Markdown</w:t>
-            </w:r>
-            <w:proofErr w:type="spellEnd"/>
-            <w:r>
-              <w:t xml:space="preserve"> (GitHub </w:t>
-            </w:r>
-            <w:proofErr w:type="spellStart"/>
-            <w:r>
-              <w:t>flavored</w:t>
-            </w:r>
-            <w:proofErr w:type="spellEnd"/>
-            <w:r>
-              <w:t>)</w:t>
+            <w:r>
+              <w:t>Markdown (GitHub flavored)</w:t>
             </w:r>
           </w:p>
         </w:tc>
@@ -1327,43 +960,19 @@
           </w:tcPr>
           <w:p>
             <w:r>
-              <w:t xml:space="preserve">Mostrar microservicios, flujos, Docker </w:t>
-            </w:r>
-            <w:proofErr w:type="spellStart"/>
-            <w:r>
-              <w:t>Compose</w:t>
-            </w:r>
-            <w:proofErr w:type="spellEnd"/>
-            <w:r>
-              <w:t>, puertos, seguridad</w:t>
-            </w:r>
-          </w:p>
-        </w:tc>
-        <w:tc>
-          <w:tcPr>
-            <w:tcW w:w="0" w:type="auto"/>
-            <w:vAlign w:val="center"/>
-            <w:hideMark/>
-          </w:tcPr>
-          <w:p>
-            <w:r>
-              <w:t xml:space="preserve">Draw.io / </w:t>
-            </w:r>
-            <w:proofErr w:type="spellStart"/>
-            <w:r>
-              <w:t>Lucidchart</w:t>
-            </w:r>
-            <w:proofErr w:type="spellEnd"/>
-            <w:r>
-              <w:t xml:space="preserve"> / </w:t>
-            </w:r>
-            <w:proofErr w:type="spellStart"/>
-            <w:r>
-              <w:t>Excalidraw</w:t>
-            </w:r>
-            <w:proofErr w:type="spellEnd"/>
-            <w:r>
-              <w:t xml:space="preserve"> exportado a PNG/PDF</w:t>
+              <w:t>Mostrar microservicios, flujos, Docker Compose, puertos, seguridad</w:t>
+            </w:r>
+          </w:p>
+        </w:tc>
+        <w:tc>
+          <w:tcPr>
+            <w:tcW w:w="0" w:type="auto"/>
+            <w:vAlign w:val="center"/>
+            <w:hideMark/>
+          </w:tcPr>
+          <w:p>
+            <w:r>
+              <w:t>Draw.io / Lucidchart / Excalidraw exportado a PNG/PDF</w:t>
             </w:r>
           </w:p>
         </w:tc>
@@ -1411,15 +1020,7 @@
               <w:t>Manual de Instalación / Despliegue</w:t>
             </w:r>
             <w:r>
-              <w:t xml:space="preserve"> (</w:t>
-            </w:r>
-            <w:proofErr w:type="spellStart"/>
-            <w:r>
-              <w:t>Deployment</w:t>
-            </w:r>
-            <w:proofErr w:type="spellEnd"/>
-            <w:r>
-              <w:t xml:space="preserve"> Guide)</w:t>
+              <w:t xml:space="preserve"> (Deployment Guide)</w:t>
             </w:r>
           </w:p>
         </w:tc>
@@ -1443,15 +1044,7 @@
           </w:tcPr>
           <w:p>
             <w:r>
-              <w:t>Paso a paso: local, Docker, producción simulada (</w:t>
-            </w:r>
-            <w:proofErr w:type="spellStart"/>
-            <w:r>
-              <w:t>cloud</w:t>
-            </w:r>
-            <w:proofErr w:type="spellEnd"/>
-            <w:r>
-              <w:t>)</w:t>
+              <w:t>Paso a paso: local, Docker, producción simulada (cloud)</w:t>
             </w:r>
           </w:p>
         </w:tc>
@@ -1508,17 +1101,8 @@
                 <w:b/>
                 <w:bCs/>
               </w:rPr>
-              <w:t xml:space="preserve">Manual de Usuario / API </w:t>
-            </w:r>
-            <w:proofErr w:type="spellStart"/>
-            <w:r>
-              <w:rPr>
-                <w:b/>
-                <w:bCs/>
-              </w:rPr>
-              <w:t>Documentation</w:t>
-            </w:r>
-            <w:proofErr w:type="spellEnd"/>
+              <w:t>Manual de Usuario / API Documentation</w:t>
+            </w:r>
           </w:p>
         </w:tc>
         <w:tc>
@@ -1541,43 +1125,19 @@
           </w:tcPr>
           <w:p>
             <w:r>
-              <w:t>Cómo consumir la API (</w:t>
-            </w:r>
-            <w:proofErr w:type="spellStart"/>
-            <w:r>
-              <w:t>endpoints</w:t>
-            </w:r>
-            <w:proofErr w:type="spellEnd"/>
-            <w:r>
-              <w:t xml:space="preserve">, </w:t>
-            </w:r>
-            <w:proofErr w:type="spellStart"/>
-            <w:r>
-              <w:t>auth</w:t>
-            </w:r>
-            <w:proofErr w:type="spellEnd"/>
-            <w:r>
-              <w:t>, ejemplos)</w:t>
-            </w:r>
-          </w:p>
-        </w:tc>
-        <w:tc>
-          <w:tcPr>
-            <w:tcW w:w="0" w:type="auto"/>
-            <w:vAlign w:val="center"/>
-            <w:hideMark/>
-          </w:tcPr>
-          <w:p>
-            <w:r>
-              <w:t>Swagger/</w:t>
-            </w:r>
-            <w:proofErr w:type="spellStart"/>
-            <w:r>
-              <w:t>OpenAPI</w:t>
-            </w:r>
-            <w:proofErr w:type="spellEnd"/>
-            <w:r>
-              <w:t xml:space="preserve"> + sección en README</w:t>
+              <w:t>Cómo consumir la API (endpoints, auth, ejemplos)</w:t>
+            </w:r>
+          </w:p>
+        </w:tc>
+        <w:tc>
+          <w:tcPr>
+            <w:tcW w:w="0" w:type="auto"/>
+            <w:vAlign w:val="center"/>
+            <w:hideMark/>
+          </w:tcPr>
+          <w:p>
+            <w:r>
+              <w:t>Swagger/OpenAPI + sección en README</w:t>
             </w:r>
           </w:p>
         </w:tc>
@@ -1622,33 +1182,8 @@
                 <w:b/>
                 <w:bCs/>
               </w:rPr>
-              <w:t xml:space="preserve">Análisis de Seguridad / </w:t>
-            </w:r>
-            <w:proofErr w:type="spellStart"/>
-            <w:r>
-              <w:rPr>
-                <w:b/>
-                <w:bCs/>
-              </w:rPr>
-              <w:t>DevSecOps</w:t>
-            </w:r>
-            <w:proofErr w:type="spellEnd"/>
-            <w:r>
-              <w:rPr>
-                <w:b/>
-                <w:bCs/>
-              </w:rPr>
-              <w:t xml:space="preserve"> </w:t>
-            </w:r>
-            <w:proofErr w:type="spellStart"/>
-            <w:r>
-              <w:rPr>
-                <w:b/>
-                <w:bCs/>
-              </w:rPr>
-              <w:t>Report</w:t>
-            </w:r>
-            <w:proofErr w:type="spellEnd"/>
+              <w:t>Análisis de Seguridad / DevSecOps Report</w:t>
+            </w:r>
           </w:p>
         </w:tc>
         <w:tc>
@@ -1671,15 +1206,7 @@
           </w:tcPr>
           <w:p>
             <w:r>
-              <w:t xml:space="preserve">Amenazas OWASP, controles implementados, encriptación, JWT, </w:t>
-            </w:r>
-            <w:proofErr w:type="spellStart"/>
-            <w:r>
-              <w:t>rate-limit</w:t>
-            </w:r>
-            <w:proofErr w:type="spellEnd"/>
-            <w:r>
-              <w:t>, etc.</w:t>
+              <w:t>Amenazas OWASP, controles implementados, encriptación, JWT, rate-limit, etc.</w:t>
             </w:r>
           </w:p>
         </w:tc>
@@ -1731,37 +1258,12 @@
             <w:hideMark/>
           </w:tcPr>
           <w:p>
-            <w:proofErr w:type="spellStart"/>
             <w:r>
               <w:rPr>
                 <w:b/>
                 <w:bCs/>
               </w:rPr>
-              <w:t>Dockerfile</w:t>
-            </w:r>
-            <w:proofErr w:type="spellEnd"/>
-            <w:r>
-              <w:rPr>
-                <w:b/>
-                <w:bCs/>
-              </w:rPr>
-              <w:t xml:space="preserve">(s) + </w:t>
-            </w:r>
-            <w:proofErr w:type="spellStart"/>
-            <w:r>
-              <w:rPr>
-                <w:b/>
-                <w:bCs/>
-              </w:rPr>
-              <w:t>docker-compose.yml</w:t>
-            </w:r>
-            <w:proofErr w:type="spellEnd"/>
-            <w:r>
-              <w:rPr>
-                <w:b/>
-                <w:bCs/>
-              </w:rPr>
-              <w:t xml:space="preserve"> comentados</w:t>
+              <w:t>Dockerfile(s) + docker-compose.yml comentados</w:t>
             </w:r>
           </w:p>
         </w:tc>
@@ -1785,51 +1287,19 @@
           </w:tcPr>
           <w:p>
             <w:r>
-              <w:t xml:space="preserve">Explicar cada línea relevante (seguridad: </w:t>
-            </w:r>
-            <w:proofErr w:type="spellStart"/>
-            <w:r>
-              <w:t>user</w:t>
-            </w:r>
-            <w:proofErr w:type="spellEnd"/>
-            <w:r>
-              <w:t xml:space="preserve"> no-</w:t>
-            </w:r>
-            <w:proofErr w:type="spellStart"/>
-            <w:r>
-              <w:t>root</w:t>
-            </w:r>
-            <w:proofErr w:type="spellEnd"/>
-            <w:r>
-              <w:t xml:space="preserve">, </w:t>
-            </w:r>
-            <w:proofErr w:type="spellStart"/>
-            <w:r>
-              <w:t>multi-stage</w:t>
-            </w:r>
-            <w:proofErr w:type="spellEnd"/>
-            <w:r>
-              <w:t>)</w:t>
-            </w:r>
-          </w:p>
-        </w:tc>
-        <w:tc>
-          <w:tcPr>
-            <w:tcW w:w="0" w:type="auto"/>
-            <w:vAlign w:val="center"/>
-            <w:hideMark/>
-          </w:tcPr>
-          <w:p>
-            <w:r>
-              <w:t xml:space="preserve">Comentarios </w:t>
-            </w:r>
-            <w:proofErr w:type="spellStart"/>
-            <w:r>
-              <w:t>inline</w:t>
-            </w:r>
-            <w:proofErr w:type="spellEnd"/>
-            <w:r>
-              <w:t xml:space="preserve"> + explicación en README</w:t>
+              <w:t>Explicar cada línea relevante (seguridad: user no-root, multi-stage)</w:t>
+            </w:r>
+          </w:p>
+        </w:tc>
+        <w:tc>
+          <w:tcPr>
+            <w:tcW w:w="0" w:type="auto"/>
+            <w:vAlign w:val="center"/>
+            <w:hideMark/>
+          </w:tcPr>
+          <w:p>
+            <w:r>
+              <w:t>Comentarios inline + explicación en README</w:t>
             </w:r>
           </w:p>
         </w:tc>
@@ -1898,39 +1368,7 @@
           </w:tcPr>
           <w:p>
             <w:r>
-              <w:t xml:space="preserve">Resultados de </w:t>
-            </w:r>
-            <w:proofErr w:type="spellStart"/>
-            <w:r>
-              <w:t>docker</w:t>
-            </w:r>
-            <w:proofErr w:type="spellEnd"/>
-            <w:r>
-              <w:t xml:space="preserve"> </w:t>
-            </w:r>
-            <w:proofErr w:type="spellStart"/>
-            <w:r>
-              <w:t>scan</w:t>
-            </w:r>
-            <w:proofErr w:type="spellEnd"/>
-            <w:r>
-              <w:t xml:space="preserve">, </w:t>
-            </w:r>
-            <w:proofErr w:type="spellStart"/>
-            <w:r>
-              <w:t>Trivy</w:t>
-            </w:r>
-            <w:proofErr w:type="spellEnd"/>
-            <w:r>
-              <w:t xml:space="preserve">, </w:t>
-            </w:r>
-            <w:proofErr w:type="spellStart"/>
-            <w:r>
-              <w:t>Snyk</w:t>
-            </w:r>
-            <w:proofErr w:type="spellEnd"/>
-            <w:r>
-              <w:t xml:space="preserve"> o manual</w:t>
+              <w:t>Resultados de docker scan, Trivy, Snyk o manual</w:t>
             </w:r>
           </w:p>
         </w:tc>
@@ -1987,23 +1425,7 @@
                 <w:b/>
                 <w:bCs/>
               </w:rPr>
-              <w:t xml:space="preserve">Pruebas (Test </w:t>
-            </w:r>
-            <w:proofErr w:type="spellStart"/>
-            <w:r>
-              <w:rPr>
-                <w:b/>
-                <w:bCs/>
-              </w:rPr>
-              <w:t>Report</w:t>
-            </w:r>
-            <w:proofErr w:type="spellEnd"/>
-            <w:r>
-              <w:rPr>
-                <w:b/>
-                <w:bCs/>
-              </w:rPr>
-              <w:t>)</w:t>
+              <w:t>Pruebas (Test Report)</w:t>
             </w:r>
           </w:p>
         </w:tc>
@@ -2027,48 +1449,19 @@
           </w:tcPr>
           <w:p>
             <w:r>
-              <w:t xml:space="preserve">Cobertura unitaria + Postman </w:t>
-            </w:r>
-            <w:proofErr w:type="spellStart"/>
-            <w:r>
-              <w:t>collection</w:t>
-            </w:r>
-            <w:proofErr w:type="spellEnd"/>
-            <w:r>
-              <w:t xml:space="preserve"> o </w:t>
-            </w:r>
-            <w:proofErr w:type="spellStart"/>
-            <w:r>
-              <w:t>curl</w:t>
-            </w:r>
-            <w:proofErr w:type="spellEnd"/>
-            <w:r>
-              <w:t xml:space="preserve"> </w:t>
-            </w:r>
-            <w:proofErr w:type="spellStart"/>
-            <w:r>
-              <w:t>examples</w:t>
-            </w:r>
-            <w:proofErr w:type="spellEnd"/>
-          </w:p>
-        </w:tc>
-        <w:tc>
-          <w:tcPr>
-            <w:tcW w:w="0" w:type="auto"/>
-            <w:vAlign w:val="center"/>
-            <w:hideMark/>
-          </w:tcPr>
-          <w:p>
-            <w:r>
-              <w:t>Carpeta /</w:t>
-            </w:r>
-            <w:proofErr w:type="spellStart"/>
-            <w:r>
-              <w:t>docs</w:t>
-            </w:r>
-            <w:proofErr w:type="spellEnd"/>
-            <w:r>
-              <w:t xml:space="preserve"> o sección README</w:t>
+              <w:t>Cobertura unitaria + Postman collection o curl examples</w:t>
+            </w:r>
+          </w:p>
+        </w:tc>
+        <w:tc>
+          <w:tcPr>
+            <w:tcW w:w="0" w:type="auto"/>
+            <w:vAlign w:val="center"/>
+            <w:hideMark/>
+          </w:tcPr>
+          <w:p>
+            <w:r>
+              <w:t>Carpeta /docs o sección README</w:t>
             </w:r>
           </w:p>
         </w:tc>
@@ -2206,15 +1599,7 @@
         </w:numPr>
       </w:pPr>
       <w:r>
-        <w:t xml:space="preserve">Título: </w:t>
-      </w:r>
-      <w:proofErr w:type="spellStart"/>
-      <w:r>
-        <w:t>SecureVault</w:t>
-      </w:r>
-      <w:proofErr w:type="spellEnd"/>
-      <w:r>
-        <w:t xml:space="preserve"> API – Gestor Seguro de Secretos en Microservicios</w:t>
+        <w:t>Título: SecureVault API – Gestor Seguro de Secretos en Microservicios</w:t>
       </w:r>
     </w:p>
     <w:p>
@@ -2280,15 +1665,7 @@
         </w:numPr>
       </w:pPr>
       <w:r>
-        <w:t xml:space="preserve">Contexto (por qué un gestor de secretos seguro en </w:t>
-      </w:r>
-      <w:proofErr w:type="spellStart"/>
-      <w:r>
-        <w:t>cloud</w:t>
-      </w:r>
-      <w:proofErr w:type="spellEnd"/>
-      <w:r>
-        <w:t>/DevOps)</w:t>
+        <w:t>Contexto (por qué un gestor de secretos seguro en cloud/DevOps)</w:t>
       </w:r>
     </w:p>
     <w:p>
@@ -2328,15 +1705,7 @@
         </w:numPr>
       </w:pPr>
       <w:r>
-        <w:t xml:space="preserve">OWASP Top 10, principios Zero Trust, </w:t>
-      </w:r>
-      <w:proofErr w:type="spellStart"/>
-      <w:r>
-        <w:t>DevSecOps</w:t>
-      </w:r>
-      <w:proofErr w:type="spellEnd"/>
-      <w:r>
-        <w:t>, cifrado en reposo/transito</w:t>
+        <w:t>OWASP Top 10, principios Zero Trust, DevSecOps, cifrado en reposo/transito</w:t>
       </w:r>
     </w:p>
     <w:p>
@@ -2362,15 +1731,7 @@
         </w:numPr>
       </w:pPr>
       <w:r>
-        <w:t xml:space="preserve">Diagrama (microservicios, DB, flujos de </w:t>
-      </w:r>
-      <w:proofErr w:type="spellStart"/>
-      <w:r>
-        <w:t>auth</w:t>
-      </w:r>
-      <w:proofErr w:type="spellEnd"/>
-      <w:r>
-        <w:t xml:space="preserve"> y encriptación)</w:t>
+        <w:t>Diagrama (microservicios, DB, flujos de auth y encriptación)</w:t>
       </w:r>
     </w:p>
     <w:p>
@@ -2418,23 +1779,7 @@
         </w:numPr>
       </w:pPr>
       <w:r>
-        <w:t xml:space="preserve">Decisiones clave de seguridad (AES-256-GCM por usuario, JWT con RS256 o HS256 fuerte, no </w:t>
-      </w:r>
-      <w:proofErr w:type="spellStart"/>
-      <w:r>
-        <w:t>hardcode</w:t>
-      </w:r>
-      <w:proofErr w:type="spellEnd"/>
-      <w:r>
-        <w:t xml:space="preserve"> </w:t>
-      </w:r>
-      <w:proofErr w:type="spellStart"/>
-      <w:r>
-        <w:t>secrets</w:t>
-      </w:r>
-      <w:proofErr w:type="spellEnd"/>
-      <w:r>
-        <w:t>, etc.)</w:t>
+        <w:t>Decisiones clave de seguridad (AES-256-GCM por usuario, JWT con RS256 o HS256 fuerte, no hardcode secrets, etc.)</w:t>
       </w:r>
     </w:p>
     <w:p>
@@ -2444,21 +1789,12 @@
           <w:numId w:val="6"/>
         </w:numPr>
       </w:pPr>
-      <w:proofErr w:type="spellStart"/>
-      <w:r>
-        <w:rPr>
-          <w:b/>
-          <w:bCs/>
-        </w:rPr>
-        <w:t>Dockerización</w:t>
-      </w:r>
-      <w:proofErr w:type="spellEnd"/>
-      <w:r>
-        <w:rPr>
-          <w:b/>
-          <w:bCs/>
-        </w:rPr>
-        <w:t xml:space="preserve"> y DevOps</w:t>
+      <w:r>
+        <w:rPr>
+          <w:b/>
+          <w:bCs/>
+        </w:rPr>
+        <w:t>Dockerización y DevOps</w:t>
       </w:r>
     </w:p>
     <w:p>
@@ -2469,21 +1805,8 @@
         </w:numPr>
       </w:pPr>
       <w:r>
-        <w:t xml:space="preserve">Explicación </w:t>
-      </w:r>
-      <w:proofErr w:type="spellStart"/>
-      <w:r>
-        <w:t>Dockerfile</w:t>
-      </w:r>
-      <w:proofErr w:type="spellEnd"/>
-      <w:r>
-        <w:t xml:space="preserve"> </w:t>
-      </w:r>
-      <w:proofErr w:type="spellStart"/>
-      <w:r>
-        <w:t>multi-stage</w:t>
-      </w:r>
-      <w:proofErr w:type="spellEnd"/>
+        <w:t>Explicación Dockerfile multi-stage</w:t>
+      </w:r>
     </w:p>
     <w:p>
       <w:pPr>
@@ -2499,21 +1822,7 @@
         <w:rPr>
           <w:lang w:val="en-US"/>
         </w:rPr>
-        <w:t>docker-</w:t>
-      </w:r>
-      <w:proofErr w:type="spellStart"/>
-      <w:r>
-        <w:rPr>
-          <w:lang w:val="en-US"/>
-        </w:rPr>
-        <w:t>compose.yml</w:t>
-      </w:r>
-      <w:proofErr w:type="spellEnd"/>
-      <w:r>
-        <w:rPr>
-          <w:lang w:val="en-US"/>
-        </w:rPr>
-        <w:t xml:space="preserve"> (services, networks, volumes, secrets)</w:t>
+        <w:t>docker-compose.yml (services, networks, volumes, secrets)</w:t>
       </w:r>
     </w:p>
     <w:p>
@@ -2524,31 +1833,7 @@
         </w:numPr>
       </w:pPr>
       <w:r>
-        <w:t>Buenas prácticas aplicadas (non-</w:t>
-      </w:r>
-      <w:proofErr w:type="spellStart"/>
-      <w:r>
-        <w:t>root</w:t>
-      </w:r>
-      <w:proofErr w:type="spellEnd"/>
-      <w:r>
-        <w:t xml:space="preserve"> </w:t>
-      </w:r>
-      <w:proofErr w:type="spellStart"/>
-      <w:r>
-        <w:t>user</w:t>
-      </w:r>
-      <w:proofErr w:type="spellEnd"/>
-      <w:r>
-        <w:t>, HEALTHCHECK, .</w:t>
-      </w:r>
-      <w:proofErr w:type="spellStart"/>
-      <w:r>
-        <w:t>dockerignore</w:t>
-      </w:r>
-      <w:proofErr w:type="spellEnd"/>
-      <w:r>
-        <w:t>)</w:t>
+        <w:t>Buenas prácticas aplicadas (non-root user, HEALTHCHECK, .dockerignore)</w:t>
       </w:r>
     </w:p>
     <w:p>
@@ -2588,29 +1873,8 @@
         </w:numPr>
       </w:pPr>
       <w:r>
-        <w:t xml:space="preserve">Inyección SQL → </w:t>
-      </w:r>
-      <w:proofErr w:type="spellStart"/>
-      <w:r>
-        <w:t>Prepared</w:t>
-      </w:r>
-      <w:proofErr w:type="spellEnd"/>
-      <w:r>
-        <w:t xml:space="preserve"> </w:t>
-      </w:r>
-      <w:proofErr w:type="spellStart"/>
-      <w:r>
-        <w:t>statements</w:t>
-      </w:r>
-      <w:proofErr w:type="spellEnd"/>
-      <w:r>
-        <w:t xml:space="preserve"> + </w:t>
-      </w:r>
-      <w:proofErr w:type="spellStart"/>
-      <w:r>
-        <w:t>SQLAlchemy</w:t>
-      </w:r>
-      <w:proofErr w:type="spellEnd"/>
+        <w:t>Inyección SQL → Prepared statements + SQLAlchemy</w:t>
+      </w:r>
     </w:p>
     <w:p>
       <w:pPr>
@@ -2620,23 +1884,7 @@
         </w:numPr>
       </w:pPr>
       <w:r>
-        <w:t xml:space="preserve">Exposición de </w:t>
-      </w:r>
-      <w:proofErr w:type="spellStart"/>
-      <w:r>
-        <w:t>secrets</w:t>
-      </w:r>
-      <w:proofErr w:type="spellEnd"/>
-      <w:r>
-        <w:t xml:space="preserve"> → Docker </w:t>
-      </w:r>
-      <w:proofErr w:type="spellStart"/>
-      <w:r>
-        <w:t>secrets</w:t>
-      </w:r>
-      <w:proofErr w:type="spellEnd"/>
-      <w:r>
-        <w:t xml:space="preserve"> + variables de entorno</w:t>
+        <w:t>Exposición de secrets → Docker secrets + variables de entorno</w:t>
       </w:r>
     </w:p>
     <w:p>
@@ -2647,23 +1895,7 @@
         </w:numPr>
       </w:pPr>
       <w:r>
-        <w:t xml:space="preserve">Ataques de fuerza bruta → Rate </w:t>
-      </w:r>
-      <w:proofErr w:type="spellStart"/>
-      <w:r>
-        <w:t>limiting</w:t>
-      </w:r>
-      <w:proofErr w:type="spellEnd"/>
-      <w:r>
-        <w:t xml:space="preserve"> (</w:t>
-      </w:r>
-      <w:proofErr w:type="spellStart"/>
-      <w:r>
-        <w:t>slowapi</w:t>
-      </w:r>
-      <w:proofErr w:type="spellEnd"/>
-      <w:r>
-        <w:t xml:space="preserve"> o similar)</w:t>
+        <w:t>Ataques de fuerza bruta → Rate limiting (slowapi o similar)</w:t>
       </w:r>
     </w:p>
     <w:p>
@@ -2832,23 +2064,7 @@
         <w:t>capturas de pantalla</w:t>
       </w:r>
       <w:r>
-        <w:t xml:space="preserve"> reales: </w:t>
-      </w:r>
-      <w:proofErr w:type="spellStart"/>
-      <w:r>
-        <w:t>docker</w:t>
-      </w:r>
-      <w:proofErr w:type="spellEnd"/>
-      <w:r>
-        <w:t xml:space="preserve"> </w:t>
-      </w:r>
-      <w:proofErr w:type="spellStart"/>
-      <w:r>
-        <w:t>ps</w:t>
-      </w:r>
-      <w:proofErr w:type="spellEnd"/>
-      <w:r>
-        <w:t>, Swagger UI, logs de autenticación fallida, etc.</w:t>
+        <w:t xml:space="preserve"> reales: docker ps, Swagger UI, logs de autenticación fallida, etc.</w:t>
       </w:r>
     </w:p>
     <w:p>
@@ -2886,17 +2102,8 @@
           <w:b/>
           <w:bCs/>
         </w:rPr>
-        <w:t xml:space="preserve">CIS Docker </w:t>
-      </w:r>
-      <w:proofErr w:type="spellStart"/>
-      <w:r>
-        <w:rPr>
-          <w:b/>
-          <w:bCs/>
-        </w:rPr>
-        <w:t>Benchmarks</w:t>
-      </w:r>
-      <w:proofErr w:type="spellEnd"/>
+        <w:t>CIS Docker Benchmarks</w:t>
+      </w:r>
       <w:r>
         <w:t>.</w:t>
       </w:r>
@@ -2916,17 +2123,8 @@
           <w:b/>
           <w:bCs/>
         </w:rPr>
-        <w:t>repositorio público o privado en GitHub/</w:t>
-      </w:r>
-      <w:proofErr w:type="spellStart"/>
-      <w:r>
-        <w:rPr>
-          <w:b/>
-          <w:bCs/>
-        </w:rPr>
-        <w:t>GitLab</w:t>
-      </w:r>
-      <w:proofErr w:type="spellEnd"/>
+        <w:t>repositorio público o privado en GitHub/GitLab</w:t>
+      </w:r>
       <w:r>
         <w:t xml:space="preserve"> con licencia MIT o similar.</w:t>
       </w:r>
@@ -2941,32 +2139,15 @@
       <w:r>
         <w:t xml:space="preserve">Genera el </w:t>
       </w:r>
-      <w:proofErr w:type="spellStart"/>
-      <w:r>
-        <w:rPr>
-          <w:b/>
-          <w:bCs/>
-        </w:rPr>
-        <w:t>OpenAPI</w:t>
-      </w:r>
-      <w:proofErr w:type="spellEnd"/>
-      <w:r>
-        <w:rPr>
-          <w:b/>
-          <w:bCs/>
-        </w:rPr>
-        <w:t>/Swagger</w:t>
-      </w:r>
-      <w:r>
-        <w:t xml:space="preserve"> automáticamente (</w:t>
-      </w:r>
-      <w:proofErr w:type="spellStart"/>
-      <w:r>
-        <w:t>FastAPI</w:t>
-      </w:r>
-      <w:proofErr w:type="spellEnd"/>
-      <w:r>
-        <w:t xml:space="preserve"> lo hace solo) y expórtalo como YAML para anexarlo.</w:t>
+      <w:r>
+        <w:rPr>
+          <w:b/>
+          <w:bCs/>
+        </w:rPr>
+        <w:t>OpenAPI/Swagger</w:t>
+      </w:r>
+      <w:r>
+        <w:t xml:space="preserve"> automáticamente (FastAPI lo hace solo) y expórtalo como YAML para anexarlo.</w:t>
       </w:r>
     </w:p>
     <w:p/>
@@ -2982,36 +2163,12 @@
           <w:b/>
           <w:bCs/>
         </w:rPr>
-        <w:t xml:space="preserve">Opción A – Recomendada (Python + </w:t>
-      </w:r>
-      <w:proofErr w:type="spellStart"/>
-      <w:r>
-        <w:rPr>
-          <w:b/>
-          <w:bCs/>
-        </w:rPr>
-        <w:t>FastAPI</w:t>
-      </w:r>
-      <w:proofErr w:type="spellEnd"/>
-      <w:r>
-        <w:rPr>
-          <w:b/>
-          <w:bCs/>
-        </w:rPr>
-        <w:t>)</w:t>
-      </w:r>
-    </w:p>
-    <w:p>
-      <w:r>
-        <w:t xml:space="preserve">Más moderna, ligera, excelente documentación automática (Swagger), y muy valorada en entornos </w:t>
-      </w:r>
-      <w:proofErr w:type="spellStart"/>
-      <w:r>
-        <w:t>DevSecOps</w:t>
-      </w:r>
-      <w:proofErr w:type="spellEnd"/>
-      <w:r>
-        <w:t>/Cloud 2025–2026.</w:t>
+        <w:t>Opción A – Recomendada (Python + FastAPI)</w:t>
+      </w:r>
+    </w:p>
+    <w:p>
+      <w:r>
+        <w:t>Más moderna, ligera, excelente documentación automática (Swagger), y muy valorada en entornos DevSecOps/Cloud 2025–2026.</w:t>
       </w:r>
     </w:p>
     <w:p>
@@ -3033,27 +2190,9 @@
           <w:numId w:val="8"/>
         </w:numPr>
       </w:pPr>
-      <w:proofErr w:type="spellStart"/>
-      <w:r>
-        <w:t>Backend</w:t>
-      </w:r>
-      <w:proofErr w:type="spellEnd"/>
-      <w:r>
-        <w:t xml:space="preserve">: Python 3.11+ + </w:t>
-      </w:r>
-      <w:proofErr w:type="spellStart"/>
-      <w:r>
-        <w:t>FastAPI</w:t>
-      </w:r>
-      <w:proofErr w:type="spellEnd"/>
-      <w:r>
-        <w:t xml:space="preserve"> + </w:t>
-      </w:r>
-      <w:proofErr w:type="spellStart"/>
-      <w:r>
-        <w:t>Uvicorn</w:t>
-      </w:r>
-      <w:proofErr w:type="spellEnd"/>
+      <w:r>
+        <w:t>Backend: Python 3.11+ + FastAPI + Uvicorn</w:t>
+      </w:r>
     </w:p>
     <w:p>
       <w:pPr>
@@ -3065,216 +2204,115 @@
           <w:lang w:val="en-US"/>
         </w:rPr>
       </w:pPr>
-      <w:proofErr w:type="spellStart"/>
       <w:r>
         <w:rPr>
           <w:lang w:val="en-US"/>
         </w:rPr>
-        <w:t>Autenticación</w:t>
-      </w:r>
-      <w:proofErr w:type="spellEnd"/>
-      <w:r>
+        <w:t>Autenticación: JWT (PyJWT) + OAuth2 Password Bearer</w:t>
+      </w:r>
+    </w:p>
+    <w:p>
+      <w:pPr>
+        <w:numPr>
+          <w:ilvl w:val="0"/>
+          <w:numId w:val="8"/>
+        </w:numPr>
+      </w:pPr>
+      <w:r>
+        <w:t>Encriptación: cryptography (AES-256-GCM con clave derivada por usuario via PBKDF2)</w:t>
+      </w:r>
+    </w:p>
+    <w:p>
+      <w:pPr>
+        <w:numPr>
+          <w:ilvl w:val="0"/>
+          <w:numId w:val="8"/>
+        </w:numPr>
+      </w:pPr>
+      <w:r>
+        <w:t>Base de datos: PostgreSQL (o SQLite para simplicidad inicial)</w:t>
+      </w:r>
+    </w:p>
+    <w:p>
+      <w:pPr>
+        <w:numPr>
+          <w:ilvl w:val="0"/>
+          <w:numId w:val="8"/>
+        </w:numPr>
+      </w:pPr>
+      <w:r>
+        <w:t>Rate limiting: slowapi</w:t>
+      </w:r>
+    </w:p>
+    <w:p>
+      <w:pPr>
+        <w:numPr>
+          <w:ilvl w:val="0"/>
+          <w:numId w:val="8"/>
+        </w:numPr>
+      </w:pPr>
+      <w:r>
+        <w:t>Logging: structlog o logging JSON</w:t>
+      </w:r>
+    </w:p>
+    <w:p>
+      <w:pPr>
+        <w:numPr>
+          <w:ilvl w:val="0"/>
+          <w:numId w:val="8"/>
+        </w:numPr>
         <w:rPr>
           <w:lang w:val="en-US"/>
         </w:rPr>
-        <w:t>: JWT (</w:t>
-      </w:r>
-      <w:proofErr w:type="spellStart"/>
+      </w:pPr>
       <w:r>
         <w:rPr>
           <w:lang w:val="en-US"/>
         </w:rPr>
-        <w:t>PyJWT</w:t>
-      </w:r>
-      <w:proofErr w:type="spellEnd"/>
-      <w:r>
+        <w:t>Docker: multi-stage build, non-root user, HEALTHCHECK</w:t>
+      </w:r>
+    </w:p>
+    <w:p>
+      <w:pPr>
+        <w:numPr>
+          <w:ilvl w:val="0"/>
+          <w:numId w:val="8"/>
+        </w:numPr>
+      </w:pPr>
+      <w:r>
+        <w:t>Orquestación: Docker Compose (auth + vault + db)</w:t>
+      </w:r>
+    </w:p>
+    <w:p>
+      <w:r>
+        <w:rPr>
+          <w:b/>
+          <w:bCs/>
+        </w:rPr>
+        <w:t>Estructura de carpetas básica</w:t>
+      </w:r>
+      <w:r>
+        <w:t xml:space="preserve"> (para el repo):</w:t>
+      </w:r>
+    </w:p>
+    <w:p>
+      <w:pPr>
         <w:rPr>
           <w:lang w:val="en-US"/>
         </w:rPr>
-        <w:t>) + OAuth2 Password Bearer</w:t>
-      </w:r>
-    </w:p>
-    <w:p>
-      <w:pPr>
-        <w:numPr>
-          <w:ilvl w:val="0"/>
-          <w:numId w:val="8"/>
-        </w:numPr>
-      </w:pPr>
-      <w:r>
-        <w:t xml:space="preserve">Encriptación: </w:t>
-      </w:r>
-      <w:proofErr w:type="spellStart"/>
-      <w:r>
-        <w:t>cryptography</w:t>
-      </w:r>
-      <w:proofErr w:type="spellEnd"/>
-      <w:r>
-        <w:t xml:space="preserve"> (AES-256-GCM con clave derivada por usuario </w:t>
-      </w:r>
-      <w:proofErr w:type="spellStart"/>
-      <w:r>
-        <w:t>via</w:t>
-      </w:r>
-      <w:proofErr w:type="spellEnd"/>
-      <w:r>
-        <w:t xml:space="preserve"> PBKDF2)</w:t>
-      </w:r>
-    </w:p>
-    <w:p>
-      <w:pPr>
-        <w:numPr>
-          <w:ilvl w:val="0"/>
-          <w:numId w:val="8"/>
-        </w:numPr>
-      </w:pPr>
-      <w:r>
-        <w:t>Base de datos: PostgreSQL (o SQLite para simplicidad inicial)</w:t>
-      </w:r>
-    </w:p>
-    <w:p>
-      <w:pPr>
-        <w:numPr>
-          <w:ilvl w:val="0"/>
-          <w:numId w:val="8"/>
-        </w:numPr>
-      </w:pPr>
-      <w:r>
-        <w:t xml:space="preserve">Rate </w:t>
-      </w:r>
-      <w:proofErr w:type="spellStart"/>
-      <w:r>
-        <w:t>limiting</w:t>
-      </w:r>
-      <w:proofErr w:type="spellEnd"/>
-      <w:r>
-        <w:t xml:space="preserve">: </w:t>
-      </w:r>
-      <w:proofErr w:type="spellStart"/>
-      <w:r>
-        <w:t>slowapi</w:t>
-      </w:r>
-      <w:proofErr w:type="spellEnd"/>
-    </w:p>
-    <w:p>
-      <w:pPr>
-        <w:numPr>
-          <w:ilvl w:val="0"/>
-          <w:numId w:val="8"/>
-        </w:numPr>
-      </w:pPr>
-      <w:proofErr w:type="spellStart"/>
-      <w:r>
-        <w:t>Logging</w:t>
-      </w:r>
-      <w:proofErr w:type="spellEnd"/>
-      <w:r>
-        <w:t xml:space="preserve">: </w:t>
-      </w:r>
-      <w:proofErr w:type="spellStart"/>
-      <w:r>
-        <w:t>structlog</w:t>
-      </w:r>
-      <w:proofErr w:type="spellEnd"/>
-      <w:r>
-        <w:t xml:space="preserve"> o </w:t>
-      </w:r>
-      <w:proofErr w:type="spellStart"/>
-      <w:r>
-        <w:t>logging</w:t>
-      </w:r>
-      <w:proofErr w:type="spellEnd"/>
-      <w:r>
-        <w:t xml:space="preserve"> JSON</w:t>
-      </w:r>
-    </w:p>
-    <w:p>
-      <w:pPr>
-        <w:numPr>
-          <w:ilvl w:val="0"/>
-          <w:numId w:val="8"/>
-        </w:numPr>
+      </w:pPr>
+      <w:r>
         <w:rPr>
           <w:lang w:val="en-US"/>
         </w:rPr>
-      </w:pPr>
-      <w:r>
-        <w:rPr>
-          <w:lang w:val="en-US"/>
-        </w:rPr>
-        <w:t>Docker: multi-stage build, non-root user, HEALTHCHECK</w:t>
-      </w:r>
-    </w:p>
-    <w:p>
-      <w:pPr>
-        <w:numPr>
-          <w:ilvl w:val="0"/>
-          <w:numId w:val="8"/>
-        </w:numPr>
-      </w:pPr>
-      <w:r>
-        <w:t xml:space="preserve">Orquestación: Docker </w:t>
-      </w:r>
-      <w:proofErr w:type="spellStart"/>
-      <w:r>
-        <w:t>Compose</w:t>
-      </w:r>
-      <w:proofErr w:type="spellEnd"/>
-      <w:r>
-        <w:t xml:space="preserve"> (</w:t>
-      </w:r>
-      <w:proofErr w:type="spellStart"/>
-      <w:r>
-        <w:t>auth</w:t>
-      </w:r>
-      <w:proofErr w:type="spellEnd"/>
-      <w:r>
-        <w:t xml:space="preserve"> + </w:t>
-      </w:r>
-      <w:proofErr w:type="spellStart"/>
-      <w:r>
-        <w:t>vault</w:t>
-      </w:r>
-      <w:proofErr w:type="spellEnd"/>
-      <w:r>
-        <w:t xml:space="preserve"> + </w:t>
-      </w:r>
-      <w:proofErr w:type="spellStart"/>
-      <w:r>
-        <w:t>db</w:t>
-      </w:r>
-      <w:proofErr w:type="spellEnd"/>
-      <w:r>
-        <w:t>)</w:t>
-      </w:r>
-    </w:p>
-    <w:p>
-      <w:r>
-        <w:rPr>
-          <w:b/>
-          <w:bCs/>
-        </w:rPr>
-        <w:t>Estructura de carpetas básica</w:t>
-      </w:r>
-      <w:r>
-        <w:t xml:space="preserve"> (para el repo):</w:t>
-      </w:r>
-    </w:p>
-    <w:p>
-      <w:pPr>
-        <w:rPr>
-          <w:lang w:val="en-US"/>
-        </w:rPr>
-      </w:pPr>
-      <w:r>
-        <w:rPr>
-          <w:lang w:val="en-US"/>
-        </w:rPr>
         <w:t>text</w:t>
       </w:r>
     </w:p>
     <w:p>
       <w:r>
+        <w:rPr>
+          <w:noProof/>
+        </w:rPr>
         <w:lastRenderedPageBreak/>
         <w:drawing>
           <wp:inline distT="0" distB="0" distL="0" distR="0" wp14:anchorId="382AF851" wp14:editId="7975A5BF">
@@ -3333,21 +2371,8 @@
         </w:numPr>
       </w:pPr>
       <w:r>
-        <w:t>Swagger/</w:t>
-      </w:r>
-      <w:proofErr w:type="spellStart"/>
-      <w:r>
-        <w:t>OpenAPI</w:t>
-      </w:r>
-      <w:proofErr w:type="spellEnd"/>
-      <w:r>
-        <w:t xml:space="preserve"> automático → manual de API listo en /</w:t>
-      </w:r>
-      <w:proofErr w:type="spellStart"/>
-      <w:r>
-        <w:t>docs</w:t>
-      </w:r>
-      <w:proofErr w:type="spellEnd"/>
+        <w:t>Swagger/OpenAPI automático → manual de API listo en /docs</w:t>
+      </w:r>
     </w:p>
     <w:p>
       <w:pPr>
@@ -3357,23 +2382,7 @@
         </w:numPr>
       </w:pPr>
       <w:r>
-        <w:t xml:space="preserve">Fácil integrar OWASP </w:t>
-      </w:r>
-      <w:proofErr w:type="spellStart"/>
-      <w:r>
-        <w:t>checks</w:t>
-      </w:r>
-      <w:proofErr w:type="spellEnd"/>
-      <w:r>
-        <w:t xml:space="preserve"> (</w:t>
-      </w:r>
-      <w:proofErr w:type="spellStart"/>
-      <w:r>
-        <w:t>Pydantic</w:t>
-      </w:r>
-      <w:proofErr w:type="spellEnd"/>
-      <w:r>
-        <w:t xml:space="preserve"> validación estricta)</w:t>
+        <w:t>Fácil integrar OWASP checks (Pydantic validación estricta)</w:t>
       </w:r>
     </w:p>
     <w:p>
@@ -3407,46 +2416,22 @@
         <w:t>Tiempo estimado</w:t>
       </w:r>
       <w:r>
-        <w:t>: 5–8 días si ya sabes algo de Python/</w:t>
-      </w:r>
-      <w:proofErr w:type="spellStart"/>
-      <w:r>
-        <w:t>FastAPI</w:t>
-      </w:r>
-      <w:proofErr w:type="spellEnd"/>
-      <w:r>
-        <w:t>.</w:t>
-      </w:r>
-    </w:p>
-    <w:p>
-      <w:pPr>
-        <w:rPr>
-          <w:b/>
-          <w:bCs/>
-        </w:rPr>
-      </w:pPr>
-      <w:r>
-        <w:rPr>
-          <w:b/>
-          <w:bCs/>
-        </w:rPr>
-        <w:t xml:space="preserve">Opción B – Node.js + Express (con </w:t>
-      </w:r>
-      <w:proofErr w:type="spellStart"/>
-      <w:r>
-        <w:rPr>
-          <w:b/>
-          <w:bCs/>
-        </w:rPr>
-        <w:t>TypeScript</w:t>
-      </w:r>
-      <w:proofErr w:type="spellEnd"/>
-      <w:r>
-        <w:rPr>
-          <w:b/>
-          <w:bCs/>
-        </w:rPr>
-        <w:t xml:space="preserve"> opcional)</w:t>
+        <w:t>: 5–8 días si ya sabes algo de Python/FastAPI.</w:t>
+      </w:r>
+    </w:p>
+    <w:p>
+      <w:pPr>
+        <w:rPr>
+          <w:b/>
+          <w:bCs/>
+        </w:rPr>
+      </w:pPr>
+      <w:r>
+        <w:rPr>
+          <w:b/>
+          <w:bCs/>
+        </w:rPr>
+        <w:t>Opción B – Node.js + Express (con TypeScript opcional)</w:t>
       </w:r>
     </w:p>
     <w:p>
@@ -3473,13 +2458,8 @@
           <w:numId w:val="10"/>
         </w:numPr>
       </w:pPr>
-      <w:proofErr w:type="spellStart"/>
-      <w:r>
-        <w:t>Backend</w:t>
-      </w:r>
-      <w:proofErr w:type="spellEnd"/>
-      <w:r>
-        <w:t>: Node.js 20+ + Express</w:t>
+      <w:r>
+        <w:t>Backend: Node.js 20+ + Express</w:t>
       </w:r>
     </w:p>
     <w:p>
@@ -3490,21 +2470,8 @@
         </w:numPr>
       </w:pPr>
       <w:r>
-        <w:t xml:space="preserve">Autenticación: </w:t>
-      </w:r>
-      <w:proofErr w:type="spellStart"/>
-      <w:r>
-        <w:t>jsonwebtoken</w:t>
-      </w:r>
-      <w:proofErr w:type="spellEnd"/>
-      <w:r>
-        <w:t xml:space="preserve"> + </w:t>
-      </w:r>
-      <w:proofErr w:type="spellStart"/>
-      <w:r>
-        <w:t>bcryptjs</w:t>
-      </w:r>
-      <w:proofErr w:type="spellEnd"/>
+        <w:t>Autenticación: jsonwebtoken + bcryptjs</w:t>
+      </w:r>
     </w:p>
     <w:p>
       <w:pPr>
@@ -3514,15 +2481,7 @@
         </w:numPr>
       </w:pPr>
       <w:r>
-        <w:t xml:space="preserve">Encriptación: </w:t>
-      </w:r>
-      <w:proofErr w:type="spellStart"/>
-      <w:r>
-        <w:t>crypto</w:t>
-      </w:r>
-      <w:proofErr w:type="spellEnd"/>
-      <w:r>
-        <w:t xml:space="preserve"> (AES-256-GCM nativo de Node)</w:t>
+        <w:t>Encriptación: crypto (AES-256-GCM nativo de Node)</w:t>
       </w:r>
     </w:p>
     <w:p>
@@ -3533,13 +2492,8 @@
         </w:numPr>
       </w:pPr>
       <w:r>
-        <w:t xml:space="preserve">ORM: Prisma (PostgreSQL) o </w:t>
-      </w:r>
-      <w:proofErr w:type="spellStart"/>
-      <w:r>
-        <w:t>Sequelize</w:t>
-      </w:r>
-      <w:proofErr w:type="spellEnd"/>
+        <w:t>ORM: Prisma (PostgreSQL) o Sequelize</w:t>
+      </w:r>
     </w:p>
     <w:p>
       <w:pPr>
@@ -3550,21 +2504,8 @@
       </w:pPr>
       <w:r>
         <w:lastRenderedPageBreak/>
-        <w:t xml:space="preserve">Rate </w:t>
-      </w:r>
-      <w:proofErr w:type="spellStart"/>
-      <w:r>
-        <w:t>limiting</w:t>
-      </w:r>
-      <w:proofErr w:type="spellEnd"/>
-      <w:r>
-        <w:t xml:space="preserve">: </w:t>
-      </w:r>
-      <w:proofErr w:type="spellStart"/>
-      <w:r>
-        <w:t>express-rate-limit</w:t>
-      </w:r>
-      <w:proofErr w:type="spellEnd"/>
+        <w:t>Rate limiting: express-rate-limit</w:t>
+      </w:r>
     </w:p>
     <w:p>
       <w:pPr>
@@ -3573,27 +2514,9 @@
           <w:numId w:val="10"/>
         </w:numPr>
       </w:pPr>
-      <w:proofErr w:type="spellStart"/>
-      <w:r>
-        <w:t>Logging</w:t>
-      </w:r>
-      <w:proofErr w:type="spellEnd"/>
-      <w:r>
-        <w:t xml:space="preserve">: </w:t>
-      </w:r>
-      <w:proofErr w:type="spellStart"/>
-      <w:r>
-        <w:t>winston</w:t>
-      </w:r>
-      <w:proofErr w:type="spellEnd"/>
-      <w:r>
-        <w:t xml:space="preserve"> + JSON </w:t>
-      </w:r>
-      <w:proofErr w:type="spellStart"/>
-      <w:r>
-        <w:t>format</w:t>
-      </w:r>
-      <w:proofErr w:type="spellEnd"/>
+      <w:r>
+        <w:t>Logging: winston + JSON format</w:t>
+      </w:r>
     </w:p>
     <w:p>
       <w:pPr>
@@ -3620,15 +2543,7 @@
         </w:numPr>
       </w:pPr>
       <w:r>
-        <w:t xml:space="preserve">Orquestación: Docker </w:t>
-      </w:r>
-      <w:proofErr w:type="spellStart"/>
-      <w:r>
-        <w:t>Compose</w:t>
-      </w:r>
-      <w:proofErr w:type="spellEnd"/>
-      <w:r>
-        <w:t xml:space="preserve"> (igual que arriba)</w:t>
+        <w:t>Orquestación: Docker Compose (igual que arriba)</w:t>
       </w:r>
     </w:p>
     <w:p>
@@ -3645,6 +2560,9 @@
     </w:p>
     <w:p>
       <w:r>
+        <w:rPr>
+          <w:noProof/>
+        </w:rPr>
         <w:drawing>
           <wp:inline distT="0" distB="0" distL="0" distR="0" wp14:anchorId="1385A14B" wp14:editId="0889797D">
             <wp:extent cx="4696480" cy="3829584"/>
@@ -3712,13 +2630,8 @@
           <w:numId w:val="11"/>
         </w:numPr>
       </w:pPr>
-      <w:proofErr w:type="spellStart"/>
-      <w:r>
-        <w:t>Crypto</w:t>
-      </w:r>
-      <w:proofErr w:type="spellEnd"/>
-      <w:r>
-        <w:t xml:space="preserve"> nativo de Node → menos dependencias externas</w:t>
+      <w:r>
+        <w:t>Crypto nativo de Node → menos dependencias externas</w:t>
       </w:r>
     </w:p>
     <w:p>
@@ -3740,15 +2653,7 @@
         </w:numPr>
       </w:pPr>
       <w:r>
-        <w:t xml:space="preserve">Puedes usar </w:t>
-      </w:r>
-      <w:proofErr w:type="spellStart"/>
-      <w:r>
-        <w:t>TypeScript</w:t>
-      </w:r>
-      <w:proofErr w:type="spellEnd"/>
-      <w:r>
-        <w:t xml:space="preserve"> para + puntos en "calidad de código"</w:t>
+        <w:t>Puedes usar TypeScript para + puntos en "calidad de código"</w:t>
       </w:r>
     </w:p>
     <w:p>
@@ -3760,15 +2665,7 @@
         <w:t>Tiempo estimado</w:t>
       </w:r>
       <w:r>
-        <w:t xml:space="preserve">: Similar, 6–9 días (un poco más si no usas </w:t>
-      </w:r>
-      <w:proofErr w:type="spellStart"/>
-      <w:r>
-        <w:t>TypeScript</w:t>
-      </w:r>
-      <w:proofErr w:type="spellEnd"/>
-      <w:r>
-        <w:t>).</w:t>
+        <w:t>: Similar, 6–9 días (un poco más si no usas TypeScript).</w:t>
       </w:r>
     </w:p>
     <w:p>
@@ -3856,23 +2753,7 @@
                 <w:b/>
                 <w:bCs/>
               </w:rPr>
-              <w:t>Opción A (</w:t>
-            </w:r>
-            <w:proofErr w:type="spellStart"/>
-            <w:r>
-              <w:rPr>
-                <w:b/>
-                <w:bCs/>
-              </w:rPr>
-              <w:t>FastAPI</w:t>
-            </w:r>
-            <w:proofErr w:type="spellEnd"/>
-            <w:r>
-              <w:rPr>
-                <w:b/>
-                <w:bCs/>
-              </w:rPr>
-              <w:t>)</w:t>
+              <w:t>Opción A (FastAPI)</w:t>
             </w:r>
           </w:p>
         </w:tc>
@@ -3923,15 +2804,7 @@
           </w:tcPr>
           <w:p>
             <w:r>
-              <w:t xml:space="preserve">Más rápido (menos </w:t>
-            </w:r>
-            <w:proofErr w:type="spellStart"/>
-            <w:r>
-              <w:t>boilerplate</w:t>
-            </w:r>
-            <w:proofErr w:type="spellEnd"/>
-            <w:r>
-              <w:t>)</w:t>
+              <w:t>Más rápido (menos boilerplate)</w:t>
             </w:r>
           </w:p>
         </w:tc>
@@ -3985,15 +2858,7 @@
           </w:tcPr>
           <w:p>
             <w:r>
-              <w:t xml:space="preserve">Buena (con </w:t>
-            </w:r>
-            <w:proofErr w:type="spellStart"/>
-            <w:r>
-              <w:t>swagger-jsdoc</w:t>
-            </w:r>
-            <w:proofErr w:type="spellEnd"/>
-            <w:r>
-              <w:t xml:space="preserve"> o similar)</w:t>
+              <w:t>Buena (con swagger-jsdoc o similar)</w:t>
             </w:r>
           </w:p>
         </w:tc>
@@ -4021,30 +2886,20 @@
             <w:hideMark/>
           </w:tcPr>
           <w:p>
-            <w:proofErr w:type="spellStart"/>
-            <w:r>
-              <w:t>cryptography</w:t>
-            </w:r>
-            <w:proofErr w:type="spellEnd"/>
-            <w:r>
-              <w:t xml:space="preserve"> (muy robusta)</w:t>
-            </w:r>
-          </w:p>
-        </w:tc>
-        <w:tc>
-          <w:tcPr>
-            <w:tcW w:w="0" w:type="auto"/>
-            <w:vAlign w:val="center"/>
-            <w:hideMark/>
-          </w:tcPr>
-          <w:p>
-            <w:proofErr w:type="spellStart"/>
-            <w:r>
-              <w:t>crypto</w:t>
-            </w:r>
-            <w:proofErr w:type="spellEnd"/>
-            <w:r>
-              <w:t xml:space="preserve"> nativo (igual de segura)</w:t>
+            <w:r>
+              <w:t>cryptography (muy robusta)</w:t>
+            </w:r>
+          </w:p>
+        </w:tc>
+        <w:tc>
+          <w:tcPr>
+            <w:tcW w:w="0" w:type="auto"/>
+            <w:vAlign w:val="center"/>
+            <w:hideMark/>
+          </w:tcPr>
+          <w:p>
+            <w:r>
+              <w:t>crypto nativo (igual de segura)</w:t>
             </w:r>
           </w:p>
         </w:tc>
@@ -4061,13 +2916,8 @@
           </w:tcPr>
           <w:p>
             <w:r>
-              <w:t xml:space="preserve">Comunidad / ejemplos </w:t>
-            </w:r>
-            <w:proofErr w:type="spellStart"/>
-            <w:r>
-              <w:t>cloud</w:t>
-            </w:r>
-            <w:proofErr w:type="spellEnd"/>
+              <w:t>Comunidad / ejemplos cloud</w:t>
+            </w:r>
           </w:p>
         </w:tc>
         <w:tc>
@@ -4090,15 +2940,7 @@
           </w:tcPr>
           <w:p>
             <w:r>
-              <w:t>Sólida, pero menos "</w:t>
-            </w:r>
-            <w:proofErr w:type="spellStart"/>
-            <w:r>
-              <w:t>hype</w:t>
-            </w:r>
-            <w:proofErr w:type="spellEnd"/>
-            <w:r>
-              <w:t>" actual</w:t>
+              <w:t>Sólida, pero menos "hype" actual</w:t>
             </w:r>
           </w:p>
         </w:tc>
@@ -4267,21 +3109,8 @@
         </w:numPr>
       </w:pPr>
       <w:r>
-        <w:t xml:space="preserve">Título: </w:t>
-      </w:r>
-      <w:proofErr w:type="spellStart"/>
-      <w:r>
-        <w:t>SecureVault</w:t>
-      </w:r>
-      <w:proofErr w:type="spellEnd"/>
-      <w:r>
-        <w:t xml:space="preserve"> API – Gestor Seguro de Secretos como Microservicios en Entorno Cloud con Enfoque </w:t>
-      </w:r>
-      <w:proofErr w:type="spellStart"/>
-      <w:r>
-        <w:t>DevSecOps</w:t>
-      </w:r>
-      <w:proofErr w:type="spellEnd"/>
+        <w:t>Título: SecureVault API – Gestor Seguro de Secretos como Microservicios en Entorno Cloud con Enfoque DevSecOps</w:t>
+      </w:r>
     </w:p>
     <w:p>
       <w:pPr>
@@ -4369,31 +3198,7 @@
         <w:t>RESUMEN EJECUTIVO</w:t>
       </w:r>
       <w:r>
-        <w:t xml:space="preserve"> (1 página) Breve </w:t>
-      </w:r>
-      <w:proofErr w:type="spellStart"/>
-      <w:r>
-        <w:t>overview</w:t>
-      </w:r>
-      <w:proofErr w:type="spellEnd"/>
-      <w:r>
-        <w:t xml:space="preserve">: objetivo, tecnologías, principales controles de seguridad implementados (encriptación AES-256-GCM, JWT, </w:t>
-      </w:r>
-      <w:proofErr w:type="spellStart"/>
-      <w:r>
-        <w:t>rate-limiting</w:t>
-      </w:r>
-      <w:proofErr w:type="spellEnd"/>
-      <w:r>
-        <w:t>, Docker non-</w:t>
-      </w:r>
-      <w:proofErr w:type="spellStart"/>
-      <w:r>
-        <w:t>root</w:t>
-      </w:r>
-      <w:proofErr w:type="spellEnd"/>
-      <w:r>
-        <w:t>, etc.), beneficios en términos de confidencialidad, integridad y disponibilidad (CIA triad), y alineación con estándares NIST/ISO.</w:t>
+        <w:t xml:space="preserve"> (1 página) Breve overview: objetivo, tecnologías, principales controles de seguridad implementados (encriptación AES-256-GCM, JWT, rate-limiting, Docker non-root, etc.), beneficios en términos de confidencialidad, integridad y disponibilidad (CIA triad), y alineación con estándares NIST/ISO.</w:t>
       </w:r>
     </w:p>
     <w:p>
@@ -4421,15 +3226,7 @@
         <w:t>INTRODUCCIÓN</w:t>
       </w:r>
       <w:r>
-        <w:t xml:space="preserve"> 1.1. Contexto y justificación del proyecto 1.2. Problema que resuelve (gestión segura de secretos en entornos </w:t>
-      </w:r>
-      <w:proofErr w:type="spellStart"/>
-      <w:r>
-        <w:t>cloud</w:t>
-      </w:r>
-      <w:proofErr w:type="spellEnd"/>
-      <w:r>
-        <w:t>/DevOps) 1.3. Objetivos</w:t>
+        <w:t xml:space="preserve"> 1.1. Contexto y justificación del proyecto 1.2. Problema que resuelve (gestión segura de secretos en entornos cloud/DevOps) 1.3. Objetivos</w:t>
       </w:r>
     </w:p>
     <w:p>
@@ -4528,243 +3325,71 @@
         <w:rPr>
           <w:lang w:val="en-US"/>
         </w:rPr>
-        <w:t xml:space="preserve">CIS Docker Benchmarks y </w:t>
-      </w:r>
-      <w:proofErr w:type="spellStart"/>
-      <w:r>
-        <w:rPr>
+        <w:t xml:space="preserve">CIS Docker Benchmarks y DevSecOps best practices 2.3. </w:t>
+      </w:r>
+      <w:r>
+        <w:t>Amenazas comunes en microservicios cloud (OWASP, MITRE ATT&amp;CK)</w:t>
+      </w:r>
+    </w:p>
+    <w:p>
+      <w:pPr>
+        <w:numPr>
+          <w:ilvl w:val="0"/>
+          <w:numId w:val="13"/>
+        </w:numPr>
+      </w:pPr>
+      <w:r>
+        <w:rPr>
+          <w:b/>
+          <w:bCs/>
+        </w:rPr>
+        <w:t>ARQUITETURA DE LA SOLUCIÓN</w:t>
+      </w:r>
+      <w:r>
+        <w:t xml:space="preserve"> 3.1. Diagrama de arquitectura (incluir imagen de Draw.io o similar) 3.2. Componentes: Auth Service, Vault Service, Base de datos 3.3. Flujos principales: Registro/Login → JWT → CRUD secretos encriptados 3.4. Tecnologías y versiones utilizadas</w:t>
+      </w:r>
+    </w:p>
+    <w:p>
+      <w:pPr>
+        <w:numPr>
+          <w:ilvl w:val="0"/>
+          <w:numId w:val="13"/>
+        </w:numPr>
+      </w:pPr>
+      <w:r>
+        <w:rPr>
+          <w:b/>
+          <w:bCs/>
+        </w:rPr>
+        <w:t>IMPLEMENTACIÓN Y DESARROLLO</w:t>
+      </w:r>
+      <w:r>
+        <w:t xml:space="preserve"> 4.1. Estructura del código y repositorio 4.2. Autenticación y autorización (JWT con expiración corta, refresh tokens opcional) 4.3. Encriptación de secretos (AES-256-GCM con clave derivada PBKDF2 por usuario) 4.4. Validaciones y protecciones OWASP (input sanitization, CORS, etc.) 4.5. Rate limiting y logging de auditoría</w:t>
+      </w:r>
+    </w:p>
+    <w:p>
+      <w:pPr>
+        <w:numPr>
+          <w:ilvl w:val="0"/>
+          <w:numId w:val="13"/>
+        </w:numPr>
+      </w:pPr>
+      <w:r>
+        <w:rPr>
+          <w:b/>
+          <w:bCs/>
           <w:lang w:val="en-US"/>
         </w:rPr>
-        <w:t>DevSecOps</w:t>
-      </w:r>
-      <w:proofErr w:type="spellEnd"/>
+        <w:t>DOCKERIZACIÓN Y DEVOPS</w:t>
+      </w:r>
       <w:r>
         <w:rPr>
           <w:lang w:val="en-US"/>
         </w:rPr>
-        <w:t xml:space="preserve"> best practices 2.3. </w:t>
-      </w:r>
-      <w:r>
-        <w:t xml:space="preserve">Amenazas comunes en microservicios </w:t>
-      </w:r>
-      <w:proofErr w:type="spellStart"/>
-      <w:r>
-        <w:t>cloud</w:t>
-      </w:r>
-      <w:proofErr w:type="spellEnd"/>
-      <w:r>
-        <w:t xml:space="preserve"> (OWASP, MITRE ATT&amp;CK)</w:t>
-      </w:r>
-    </w:p>
-    <w:p>
-      <w:pPr>
-        <w:numPr>
-          <w:ilvl w:val="0"/>
-          <w:numId w:val="13"/>
-        </w:numPr>
-      </w:pPr>
-      <w:r>
-        <w:rPr>
-          <w:b/>
-          <w:bCs/>
-        </w:rPr>
-        <w:t>ARQUITETURA DE LA SOLUCIÓN</w:t>
-      </w:r>
-      <w:r>
-        <w:t xml:space="preserve"> 3.1. Diagrama de arquitectura (incluir imagen de Draw.io o similar) 3.2. Componentes: Auth Service, Vault Service, Base de datos 3.3. Flujos principales: Registro/Login → JWT → CRUD secretos encriptados 3.4. Tecnologías y versiones utilizadas</w:t>
-      </w:r>
-    </w:p>
-    <w:p>
-      <w:pPr>
-        <w:numPr>
-          <w:ilvl w:val="0"/>
-          <w:numId w:val="13"/>
-        </w:numPr>
-      </w:pPr>
-      <w:r>
-        <w:rPr>
-          <w:b/>
-          <w:bCs/>
-        </w:rPr>
-        <w:t>IMPLEMENTACIÓN Y DESARROLLO</w:t>
-      </w:r>
-      <w:r>
-        <w:t xml:space="preserve"> 4.1. Estructura del código y repositorio 4.2. Autenticación y autorización (JWT con expiración corta, </w:t>
-      </w:r>
-      <w:proofErr w:type="spellStart"/>
-      <w:r>
-        <w:t>refresh</w:t>
-      </w:r>
-      <w:proofErr w:type="spellEnd"/>
-      <w:r>
-        <w:t xml:space="preserve"> tokens opcional) 4.3. Encriptación de secretos (AES-256-GCM con clave derivada PBKDF2 por usuario) 4.4. Validaciones y protecciones OWASP (input </w:t>
-      </w:r>
-      <w:proofErr w:type="spellStart"/>
-      <w:r>
-        <w:t>sanitization</w:t>
-      </w:r>
-      <w:proofErr w:type="spellEnd"/>
-      <w:r>
-        <w:t xml:space="preserve">, CORS, etc.) 4.5. Rate </w:t>
-      </w:r>
-      <w:proofErr w:type="spellStart"/>
-      <w:r>
-        <w:t>limiting</w:t>
-      </w:r>
-      <w:proofErr w:type="spellEnd"/>
-      <w:r>
-        <w:t xml:space="preserve"> y </w:t>
-      </w:r>
-      <w:proofErr w:type="spellStart"/>
-      <w:r>
-        <w:t>logging</w:t>
-      </w:r>
-      <w:proofErr w:type="spellEnd"/>
-      <w:r>
-        <w:t xml:space="preserve"> de auditoría</w:t>
-      </w:r>
-    </w:p>
-    <w:p>
-      <w:pPr>
-        <w:numPr>
-          <w:ilvl w:val="0"/>
-          <w:numId w:val="13"/>
-        </w:numPr>
-      </w:pPr>
-      <w:r>
-        <w:rPr>
-          <w:b/>
-          <w:bCs/>
-          <w:lang w:val="en-US"/>
-        </w:rPr>
-        <w:t>DOCKERIZACIÓN Y DEVOPS</w:t>
-      </w:r>
-      <w:r>
-        <w:rPr>
-          <w:lang w:val="en-US"/>
-        </w:rPr>
-        <w:t xml:space="preserve"> 5.1. </w:t>
-      </w:r>
-      <w:proofErr w:type="spellStart"/>
-      <w:r>
-        <w:rPr>
-          <w:lang w:val="en-US"/>
-        </w:rPr>
-        <w:t>Dockerfile</w:t>
-      </w:r>
-      <w:proofErr w:type="spellEnd"/>
-      <w:r>
-        <w:rPr>
-          <w:lang w:val="en-US"/>
-        </w:rPr>
-        <w:t xml:space="preserve"> multi-stage (non-root user, </w:t>
-      </w:r>
-      <w:proofErr w:type="spellStart"/>
-      <w:r>
-        <w:rPr>
-          <w:lang w:val="en-US"/>
-        </w:rPr>
-        <w:t>minimizar</w:t>
-      </w:r>
-      <w:proofErr w:type="spellEnd"/>
-      <w:r>
-        <w:rPr>
-          <w:lang w:val="en-US"/>
-        </w:rPr>
-        <w:t xml:space="preserve"> </w:t>
-      </w:r>
-      <w:proofErr w:type="spellStart"/>
-      <w:r>
-        <w:rPr>
-          <w:lang w:val="en-US"/>
-        </w:rPr>
-        <w:t>capas</w:t>
-      </w:r>
-      <w:proofErr w:type="spellEnd"/>
-      <w:r>
-        <w:rPr>
-          <w:lang w:val="en-US"/>
-        </w:rPr>
-        <w:t>) 5.2. docker-</w:t>
-      </w:r>
-      <w:proofErr w:type="spellStart"/>
-      <w:r>
-        <w:rPr>
-          <w:lang w:val="en-US"/>
-        </w:rPr>
-        <w:t>compose.yml</w:t>
-      </w:r>
-      <w:proofErr w:type="spellEnd"/>
-      <w:r>
-        <w:rPr>
-          <w:lang w:val="en-US"/>
-        </w:rPr>
-        <w:t xml:space="preserve"> (networks, volumes, secrets, </w:t>
-      </w:r>
-      <w:proofErr w:type="spellStart"/>
-      <w:r>
-        <w:rPr>
-          <w:lang w:val="en-US"/>
-        </w:rPr>
-        <w:t>healthchecks</w:t>
-      </w:r>
-      <w:proofErr w:type="spellEnd"/>
-      <w:r>
-        <w:rPr>
-          <w:lang w:val="en-US"/>
-        </w:rPr>
-        <w:t xml:space="preserve">) 5.3. </w:t>
-      </w:r>
-      <w:r>
-        <w:t>Buenas prácticas aplicadas (CIS Docker, .</w:t>
-      </w:r>
-      <w:proofErr w:type="spellStart"/>
-      <w:r>
-        <w:t>dockerignore</w:t>
-      </w:r>
-      <w:proofErr w:type="spellEnd"/>
-      <w:r>
-        <w:t xml:space="preserve">, no </w:t>
-      </w:r>
-      <w:proofErr w:type="spellStart"/>
-      <w:r>
-        <w:t>hardcode</w:t>
-      </w:r>
-      <w:proofErr w:type="spellEnd"/>
-      <w:r>
-        <w:t xml:space="preserve"> </w:t>
-      </w:r>
-      <w:proofErr w:type="spellStart"/>
-      <w:r>
-        <w:t>secrets</w:t>
-      </w:r>
-      <w:proofErr w:type="spellEnd"/>
-      <w:r>
-        <w:t xml:space="preserve">) 5.4. CI/CD básico (GitHub </w:t>
-      </w:r>
-      <w:proofErr w:type="spellStart"/>
-      <w:r>
-        <w:t>Actions</w:t>
-      </w:r>
-      <w:proofErr w:type="spellEnd"/>
-      <w:r>
-        <w:t xml:space="preserve">: </w:t>
-      </w:r>
-      <w:proofErr w:type="spellStart"/>
-      <w:r>
-        <w:t>build</w:t>
-      </w:r>
-      <w:proofErr w:type="spellEnd"/>
-      <w:r>
-        <w:t xml:space="preserve">, test, </w:t>
-      </w:r>
-      <w:proofErr w:type="spellStart"/>
-      <w:r>
-        <w:t>push</w:t>
-      </w:r>
-      <w:proofErr w:type="spellEnd"/>
-      <w:r>
-        <w:t xml:space="preserve"> Docker Hub)</w:t>
+        <w:t xml:space="preserve"> 5.1. Dockerfile multi-stage (non-root user, minimizar capas) 5.2. docker-compose.yml (networks, volumes, secrets, healthchecks) 5.3. </w:t>
+      </w:r>
+      <w:r>
+        <w:t>Buenas prácticas aplicadas (CIS Docker, .dockerignore, no hardcode secrets) 5.4. CI/CD básico (GitHub Actions: build, test, push Docker Hub)</w:t>
       </w:r>
     </w:p>
     <w:p>
@@ -4929,72 +3554,33 @@
             <w:hideMark/>
           </w:tcPr>
           <w:p>
-            <w:proofErr w:type="spellStart"/>
-            <w:r>
-              <w:t>Secrets</w:t>
-            </w:r>
-            <w:proofErr w:type="spellEnd"/>
-            <w:r>
-              <w:t xml:space="preserve"> en variables de entorno/Docker </w:t>
-            </w:r>
-            <w:proofErr w:type="spellStart"/>
-            <w:r>
-              <w:t>secrets</w:t>
-            </w:r>
-            <w:proofErr w:type="spellEnd"/>
-          </w:p>
-        </w:tc>
-        <w:tc>
-          <w:tcPr>
-            <w:tcW w:w="0" w:type="auto"/>
-            <w:vAlign w:val="center"/>
-            <w:hideMark/>
-          </w:tcPr>
-          <w:p>
-            <w:r>
-              <w:t xml:space="preserve">NIST </w:t>
-            </w:r>
-            <w:proofErr w:type="spellStart"/>
-            <w:r>
-              <w:t>Protect</w:t>
-            </w:r>
-            <w:proofErr w:type="spellEnd"/>
-            <w:r>
-              <w:t xml:space="preserve"> / ISO A.8.2</w:t>
-            </w:r>
-          </w:p>
-        </w:tc>
-        <w:tc>
-          <w:tcPr>
-            <w:tcW w:w="0" w:type="auto"/>
-            <w:vAlign w:val="center"/>
-            <w:hideMark/>
-          </w:tcPr>
-          <w:p>
-            <w:r>
-              <w:t>.</w:t>
-            </w:r>
-            <w:proofErr w:type="spellStart"/>
-            <w:r>
-              <w:t>env.example</w:t>
-            </w:r>
-            <w:proofErr w:type="spellEnd"/>
-            <w:r>
-              <w:t xml:space="preserve"> + no </w:t>
-            </w:r>
-            <w:proofErr w:type="spellStart"/>
-            <w:r>
-              <w:t>commits</w:t>
-            </w:r>
-            <w:proofErr w:type="spellEnd"/>
-            <w:r>
-              <w:t xml:space="preserve"> de .</w:t>
-            </w:r>
-            <w:proofErr w:type="spellStart"/>
-            <w:r>
-              <w:t>env</w:t>
-            </w:r>
-            <w:proofErr w:type="spellEnd"/>
+            <w:r>
+              <w:t>Secrets en variables de entorno/Docker secrets</w:t>
+            </w:r>
+          </w:p>
+        </w:tc>
+        <w:tc>
+          <w:tcPr>
+            <w:tcW w:w="0" w:type="auto"/>
+            <w:vAlign w:val="center"/>
+            <w:hideMark/>
+          </w:tcPr>
+          <w:p>
+            <w:r>
+              <w:t>NIST Protect / ISO A.8.2</w:t>
+            </w:r>
+          </w:p>
+        </w:tc>
+        <w:tc>
+          <w:tcPr>
+            <w:tcW w:w="0" w:type="auto"/>
+            <w:vAlign w:val="center"/>
+            <w:hideMark/>
+          </w:tcPr>
+          <w:p>
+            <w:r>
+              <w:t>.env.example + no commits de .env</w:t>
+            </w:r>
           </w:p>
         </w:tc>
       </w:tr>
@@ -5021,21 +3607,8 @@
             <w:hideMark/>
           </w:tcPr>
           <w:p>
-            <w:proofErr w:type="spellStart"/>
-            <w:r>
-              <w:t>Prepared</w:t>
-            </w:r>
-            <w:proofErr w:type="spellEnd"/>
-            <w:r>
-              <w:t xml:space="preserve"> </w:t>
-            </w:r>
-            <w:proofErr w:type="spellStart"/>
-            <w:r>
-              <w:t>statements</w:t>
-            </w:r>
-            <w:proofErr w:type="spellEnd"/>
-            <w:r>
-              <w:t xml:space="preserve"> + ORM</w:t>
+            <w:r>
+              <w:t>Prepared statements + ORM</w:t>
             </w:r>
           </w:p>
         </w:tc>
@@ -5058,13 +3631,8 @@
             <w:hideMark/>
           </w:tcPr>
           <w:p>
-            <w:proofErr w:type="spellStart"/>
-            <w:r>
-              <w:t>SQLAlchemy</w:t>
-            </w:r>
-            <w:proofErr w:type="spellEnd"/>
-            <w:r>
-              <w:t>/Prisma</w:t>
+            <w:r>
+              <w:t>SQLAlchemy/Prisma</w:t>
             </w:r>
           </w:p>
         </w:tc>
@@ -5082,13 +3650,8 @@
           <w:p>
             <w:r>
               <w:lastRenderedPageBreak/>
-              <w:t xml:space="preserve">Broken </w:t>
-            </w:r>
-            <w:proofErr w:type="spellStart"/>
-            <w:r>
-              <w:t>Authentication</w:t>
-            </w:r>
-            <w:proofErr w:type="spellEnd"/>
+              <w:t>Broken Authentication</w:t>
+            </w:r>
           </w:p>
         </w:tc>
         <w:tc>
@@ -5122,19 +3685,9 @@
             <w:hideMark/>
           </w:tcPr>
           <w:p>
-            <w:proofErr w:type="spellStart"/>
-            <w:r>
-              <w:t>PyJWT</w:t>
-            </w:r>
-            <w:proofErr w:type="spellEnd"/>
-            <w:r>
-              <w:t xml:space="preserve"> / </w:t>
-            </w:r>
-            <w:proofErr w:type="spellStart"/>
-            <w:r>
-              <w:t>jsonwebtoken</w:t>
-            </w:r>
-            <w:proofErr w:type="spellEnd"/>
+            <w:r>
+              <w:t>PyJWT / jsonwebtoken</w:t>
+            </w:r>
           </w:p>
         </w:tc>
       </w:tr>
@@ -5150,13 +3703,8 @@
           </w:tcPr>
           <w:p>
             <w:r>
-              <w:t xml:space="preserve">Sensitive Data </w:t>
-            </w:r>
-            <w:proofErr w:type="spellStart"/>
-            <w:r>
-              <w:t>Exposure</w:t>
-            </w:r>
-            <w:proofErr w:type="spellEnd"/>
+              <w:t>Sensitive Data Exposure</w:t>
+            </w:r>
           </w:p>
         </w:tc>
         <w:tc>
@@ -5190,21 +3738,8 @@
             <w:hideMark/>
           </w:tcPr>
           <w:p>
-            <w:proofErr w:type="spellStart"/>
-            <w:r>
-              <w:t>cryptography</w:t>
-            </w:r>
-            <w:proofErr w:type="spellEnd"/>
-            <w:r>
-              <w:t xml:space="preserve"> / </w:t>
-            </w:r>
-            <w:proofErr w:type="spellStart"/>
-            <w:r>
-              <w:t>crypto</w:t>
-            </w:r>
-            <w:proofErr w:type="spellEnd"/>
-            <w:r>
-              <w:t xml:space="preserve"> module</w:t>
+            <w:r>
+              <w:t>cryptography / crypto module</w:t>
             </w:r>
           </w:p>
         </w:tc>
@@ -5220,21 +3755,8 @@
             <w:hideMark/>
           </w:tcPr>
           <w:p>
-            <w:proofErr w:type="spellStart"/>
-            <w:r>
-              <w:t>Denial</w:t>
-            </w:r>
-            <w:proofErr w:type="spellEnd"/>
-            <w:r>
-              <w:t xml:space="preserve"> </w:t>
-            </w:r>
-            <w:proofErr w:type="spellStart"/>
-            <w:r>
-              <w:t>of</w:t>
-            </w:r>
-            <w:proofErr w:type="spellEnd"/>
-            <w:r>
-              <w:t xml:space="preserve"> Service</w:t>
+            <w:r>
+              <w:t>Denial of Service</w:t>
             </w:r>
           </w:p>
         </w:tc>
@@ -5254,30 +3776,8 @@
               <w:rPr>
                 <w:lang w:val="en-US"/>
               </w:rPr>
-              <w:t xml:space="preserve">Rate limiting </w:t>
-            </w:r>
-            <w:proofErr w:type="spellStart"/>
-            <w:r>
-              <w:rPr>
-                <w:lang w:val="en-US"/>
-              </w:rPr>
-              <w:t>por</w:t>
-            </w:r>
-            <w:proofErr w:type="spellEnd"/>
-            <w:r>
-              <w:rPr>
-                <w:lang w:val="en-US"/>
-              </w:rPr>
-              <w:t xml:space="preserve"> IP/</w:t>
-            </w:r>
-            <w:proofErr w:type="spellStart"/>
-            <w:r>
-              <w:rPr>
-                <w:lang w:val="en-US"/>
-              </w:rPr>
-              <w:t>usuario</w:t>
-            </w:r>
-            <w:proofErr w:type="spellEnd"/>
+              <w:t>Rate limiting por IP/usuario</w:t>
+            </w:r>
           </w:p>
         </w:tc>
         <w:tc>
@@ -5299,19 +3799,9 @@
             <w:hideMark/>
           </w:tcPr>
           <w:p>
-            <w:proofErr w:type="spellStart"/>
-            <w:r>
-              <w:t>slowapi</w:t>
-            </w:r>
-            <w:proofErr w:type="spellEnd"/>
-            <w:r>
-              <w:t xml:space="preserve"> / </w:t>
-            </w:r>
-            <w:proofErr w:type="spellStart"/>
-            <w:r>
-              <w:t>express-rate-limit</w:t>
-            </w:r>
-            <w:proofErr w:type="spellEnd"/>
+            <w:r>
+              <w:t>slowapi / express-rate-limit</w:t>
+            </w:r>
           </w:p>
         </w:tc>
       </w:tr>
@@ -5326,83 +3816,45 @@
             <w:hideMark/>
           </w:tcPr>
           <w:p>
-            <w:proofErr w:type="spellStart"/>
-            <w:r>
-              <w:t>Logging</w:t>
-            </w:r>
-            <w:proofErr w:type="spellEnd"/>
-            <w:r>
-              <w:t xml:space="preserve"> &amp; </w:t>
-            </w:r>
-            <w:proofErr w:type="spellStart"/>
-            <w:r>
-              <w:t>Monitoring</w:t>
-            </w:r>
-            <w:proofErr w:type="spellEnd"/>
-          </w:p>
-        </w:tc>
-        <w:tc>
-          <w:tcPr>
-            <w:tcW w:w="0" w:type="auto"/>
-            <w:vAlign w:val="center"/>
-            <w:hideMark/>
-          </w:tcPr>
-          <w:p>
-            <w:r>
-              <w:t xml:space="preserve">Logs estructurados JSON + </w:t>
-            </w:r>
-            <w:proofErr w:type="spellStart"/>
-            <w:r>
-              <w:t>audit</w:t>
-            </w:r>
-            <w:proofErr w:type="spellEnd"/>
-            <w:r>
-              <w:t xml:space="preserve"> </w:t>
-            </w:r>
-            <w:proofErr w:type="spellStart"/>
-            <w:r>
-              <w:t>trail</w:t>
-            </w:r>
-            <w:proofErr w:type="spellEnd"/>
-          </w:p>
-        </w:tc>
-        <w:tc>
-          <w:tcPr>
-            <w:tcW w:w="0" w:type="auto"/>
-            <w:vAlign w:val="center"/>
-            <w:hideMark/>
-          </w:tcPr>
-          <w:p>
-            <w:r>
-              <w:t xml:space="preserve">NIST </w:t>
-            </w:r>
-            <w:proofErr w:type="spellStart"/>
-            <w:r>
-              <w:t>Detect</w:t>
-            </w:r>
-            <w:proofErr w:type="spellEnd"/>
-          </w:p>
-        </w:tc>
-        <w:tc>
-          <w:tcPr>
-            <w:tcW w:w="0" w:type="auto"/>
-            <w:vAlign w:val="center"/>
-            <w:hideMark/>
-          </w:tcPr>
-          <w:p>
-            <w:proofErr w:type="spellStart"/>
-            <w:r>
-              <w:t>structlog</w:t>
-            </w:r>
-            <w:proofErr w:type="spellEnd"/>
-            <w:r>
-              <w:t xml:space="preserve"> / </w:t>
-            </w:r>
-            <w:proofErr w:type="spellStart"/>
-            <w:r>
-              <w:t>winston</w:t>
-            </w:r>
-            <w:proofErr w:type="spellEnd"/>
+            <w:r>
+              <w:t>Logging &amp; Monitoring</w:t>
+            </w:r>
+          </w:p>
+        </w:tc>
+        <w:tc>
+          <w:tcPr>
+            <w:tcW w:w="0" w:type="auto"/>
+            <w:vAlign w:val="center"/>
+            <w:hideMark/>
+          </w:tcPr>
+          <w:p>
+            <w:r>
+              <w:t>Logs estructurados JSON + audit trail</w:t>
+            </w:r>
+          </w:p>
+        </w:tc>
+        <w:tc>
+          <w:tcPr>
+            <w:tcW w:w="0" w:type="auto"/>
+            <w:vAlign w:val="center"/>
+            <w:hideMark/>
+          </w:tcPr>
+          <w:p>
+            <w:r>
+              <w:t>NIST Detect</w:t>
+            </w:r>
+          </w:p>
+        </w:tc>
+        <w:tc>
+          <w:tcPr>
+            <w:tcW w:w="0" w:type="auto"/>
+            <w:vAlign w:val="center"/>
+            <w:hideMark/>
+          </w:tcPr>
+          <w:p>
+            <w:r>
+              <w:t>structlog / winston</w:t>
+            </w:r>
           </w:p>
         </w:tc>
       </w:tr>
@@ -5415,31 +3867,7 @@
         </w:numPr>
       </w:pPr>
       <w:r>
-        <w:t>6.2. Resultados de escaneos (</w:t>
-      </w:r>
-      <w:proofErr w:type="spellStart"/>
-      <w:r>
-        <w:t>Trivy</w:t>
-      </w:r>
-      <w:proofErr w:type="spellEnd"/>
-      <w:r>
-        <w:t xml:space="preserve">, Docker Scout, </w:t>
-      </w:r>
-      <w:proofErr w:type="spellStart"/>
-      <w:r>
-        <w:t>Bandit</w:t>
-      </w:r>
-      <w:proofErr w:type="spellEnd"/>
-      <w:r>
-        <w:t>/</w:t>
-      </w:r>
-      <w:proofErr w:type="spellStart"/>
-      <w:r>
-        <w:t>pylint</w:t>
-      </w:r>
-      <w:proofErr w:type="spellEnd"/>
-      <w:r>
-        <w:t xml:space="preserve"> si usas Python) 6.3. Recomendaciones de mejora futura</w:t>
+        <w:t>6.2. Resultados de escaneos (Trivy, Docker Scout, Bandit/pylint si usas Python) 6.3. Recomendaciones de mejora futura</w:t>
       </w:r>
     </w:p>
     <w:p>
@@ -5457,31 +3885,7 @@
         <w:t>DESPLIEGUE Y PRUEBAS</w:t>
       </w:r>
       <w:r>
-        <w:t xml:space="preserve"> 7.1. Manual de instalación paso a paso (local y Docker) 7.2. Evidencias: capturas de Swagger, </w:t>
-      </w:r>
-      <w:proofErr w:type="spellStart"/>
-      <w:r>
-        <w:t>docker</w:t>
-      </w:r>
-      <w:proofErr w:type="spellEnd"/>
-      <w:r>
-        <w:t xml:space="preserve"> </w:t>
-      </w:r>
-      <w:proofErr w:type="spellStart"/>
-      <w:r>
-        <w:t>ps</w:t>
-      </w:r>
-      <w:proofErr w:type="spellEnd"/>
-      <w:r>
-        <w:t xml:space="preserve">, logs de </w:t>
-      </w:r>
-      <w:proofErr w:type="spellStart"/>
-      <w:r>
-        <w:t>auth</w:t>
-      </w:r>
-      <w:proofErr w:type="spellEnd"/>
-      <w:r>
-        <w:t xml:space="preserve"> fallida 7.3. Colección Postman para pruebas</w:t>
+        <w:t xml:space="preserve"> 7.1. Manual de instalación paso a paso (local y Docker) 7.2. Evidencias: capturas de Swagger, docker ps, logs de auth fallida 7.3. Colección Postman para pruebas</w:t>
       </w:r>
     </w:p>
     <w:p>
@@ -5499,39 +3903,7 @@
         <w:t>CONCLUSIONES Y LECCIONES APRENDIDAS</w:t>
       </w:r>
       <w:r>
-        <w:t xml:space="preserve"> 8.1. Cumplimiento de objetivos 8.2. Aportes a la ciberseguridad </w:t>
-      </w:r>
-      <w:proofErr w:type="spellStart"/>
-      <w:r>
-        <w:t>cloud</w:t>
-      </w:r>
-      <w:proofErr w:type="spellEnd"/>
-      <w:r>
-        <w:t>/DevOps 8.3. Trabajo futuro (</w:t>
-      </w:r>
-      <w:proofErr w:type="spellStart"/>
-      <w:r>
-        <w:t>audit</w:t>
-      </w:r>
-      <w:proofErr w:type="spellEnd"/>
-      <w:r>
-        <w:t xml:space="preserve"> </w:t>
-      </w:r>
-      <w:proofErr w:type="spellStart"/>
-      <w:r>
-        <w:t>service</w:t>
-      </w:r>
-      <w:proofErr w:type="spellEnd"/>
-      <w:r>
-        <w:t xml:space="preserve">, K8s, </w:t>
-      </w:r>
-      <w:proofErr w:type="spellStart"/>
-      <w:r>
-        <w:t>Terraform</w:t>
-      </w:r>
-      <w:proofErr w:type="spellEnd"/>
-      <w:r>
-        <w:t>, rotación de claves)</w:t>
+        <w:t xml:space="preserve"> 8.1. Cumplimiento de objetivos 8.2. Aportes a la ciberseguridad cloud/DevOps 8.3. Trabajo futuro (audit service, K8s, Terraform, rotación de claves)</w:t>
       </w:r>
     </w:p>
     <w:p>
@@ -5549,15 +3921,7 @@
         <w:t>BIBLIOGRAFÍA</w:t>
       </w:r>
       <w:r>
-        <w:t xml:space="preserve"> (APA o norma de tu </w:t>
-      </w:r>
-      <w:proofErr w:type="spellStart"/>
-      <w:r>
-        <w:t>uni</w:t>
-      </w:r>
-      <w:proofErr w:type="spellEnd"/>
-      <w:r>
-        <w:t>)</w:t>
+        <w:t xml:space="preserve"> (APA o norma de tu uni)</w:t>
       </w:r>
     </w:p>
     <w:p>
@@ -5604,13 +3968,8 @@
           <w:numId w:val="13"/>
         </w:numPr>
       </w:pPr>
-      <w:proofErr w:type="spellStart"/>
-      <w:r>
-        <w:t>OpenAPI</w:t>
-      </w:r>
-      <w:proofErr w:type="spellEnd"/>
-      <w:r>
-        <w:t xml:space="preserve"> YAML exportado</w:t>
+      <w:r>
+        <w:t>OpenAPI YAML exportado</w:t>
       </w:r>
     </w:p>
     <w:p>
@@ -5636,37 +3995,12 @@
           <w:bCs/>
         </w:rPr>
       </w:pPr>
-      <w:proofErr w:type="spellStart"/>
-      <w:r>
-        <w:rPr>
-          <w:b/>
-          <w:bCs/>
-        </w:rPr>
-        <w:t>Template</w:t>
-      </w:r>
-      <w:proofErr w:type="spellEnd"/>
-      <w:r>
-        <w:rPr>
-          <w:b/>
-          <w:bCs/>
-        </w:rPr>
-        <w:t xml:space="preserve"> completo de README.md (para tu repo GitHub/</w:t>
-      </w:r>
-      <w:proofErr w:type="spellStart"/>
-      <w:r>
-        <w:rPr>
-          <w:b/>
-          <w:bCs/>
-        </w:rPr>
-        <w:t>GitLab</w:t>
-      </w:r>
-      <w:proofErr w:type="spellEnd"/>
-      <w:r>
-        <w:rPr>
-          <w:b/>
-          <w:bCs/>
-        </w:rPr>
-        <w:t>)</w:t>
+      <w:r>
+        <w:rPr>
+          <w:b/>
+          <w:bCs/>
+        </w:rPr>
+        <w:t>Template completo de README.md (para tu repo GitHub/GitLab)</w:t>
       </w:r>
     </w:p>
     <w:p>
@@ -5689,6 +4023,7 @@
         <w:rPr>
           <w:b/>
           <w:bCs/>
+          <w:noProof/>
         </w:rPr>
         <w:lastRenderedPageBreak/>
         <w:drawing>
@@ -5781,109 +4116,51 @@
         <w:rPr>
           <w:lang w:val="en-US"/>
         </w:rPr>
-        <w:t xml:space="preserve"> (</w:t>
-      </w:r>
-      <w:proofErr w:type="spellStart"/>
-      <w:r>
+        <w:t xml:space="preserve"> (usa JWT del auth)</w:t>
+      </w:r>
+    </w:p>
+    <w:p>
+      <w:pPr>
+        <w:rPr>
+          <w:b/>
+          <w:bCs/>
+        </w:rPr>
+      </w:pPr>
+      <w:r>
+        <w:rPr>
+          <w:b/>
+          <w:bCs/>
+        </w:rPr>
+        <w:t>Despliegue en producción (simulado)</w:t>
+      </w:r>
+    </w:p>
+    <w:p>
+      <w:pPr>
+        <w:numPr>
+          <w:ilvl w:val="0"/>
+          <w:numId w:val="15"/>
+        </w:numPr>
+      </w:pPr>
+      <w:r>
+        <w:t>Usa Docker secrets para JWT_SECRET y DB_PASSWORD</w:t>
+      </w:r>
+    </w:p>
+    <w:p>
+      <w:pPr>
+        <w:numPr>
+          <w:ilvl w:val="0"/>
+          <w:numId w:val="15"/>
+        </w:numPr>
         <w:rPr>
           <w:lang w:val="en-US"/>
         </w:rPr>
-        <w:t>usa</w:t>
-      </w:r>
-      <w:proofErr w:type="spellEnd"/>
+      </w:pPr>
       <w:r>
         <w:rPr>
           <w:lang w:val="en-US"/>
         </w:rPr>
-        <w:t xml:space="preserve"> JWT del auth)</w:t>
-      </w:r>
-    </w:p>
-    <w:p>
-      <w:pPr>
-        <w:rPr>
-          <w:b/>
-          <w:bCs/>
-        </w:rPr>
-      </w:pPr>
-      <w:r>
-        <w:rPr>
-          <w:b/>
-          <w:bCs/>
-        </w:rPr>
-        <w:t>Despliegue en producción (simulado)</w:t>
-      </w:r>
-    </w:p>
-    <w:p>
-      <w:pPr>
-        <w:numPr>
-          <w:ilvl w:val="0"/>
-          <w:numId w:val="15"/>
-        </w:numPr>
-      </w:pPr>
-      <w:r>
-        <w:t xml:space="preserve">Usa Docker </w:t>
-      </w:r>
-      <w:proofErr w:type="spellStart"/>
-      <w:r>
-        <w:t>secrets</w:t>
-      </w:r>
-      <w:proofErr w:type="spellEnd"/>
-      <w:r>
-        <w:t xml:space="preserve"> para JWT_SECRET y DB_PASSWORD</w:t>
-      </w:r>
-    </w:p>
-    <w:p>
-      <w:pPr>
-        <w:numPr>
-          <w:ilvl w:val="0"/>
-          <w:numId w:val="15"/>
-        </w:numPr>
-        <w:rPr>
-          <w:lang w:val="en-US"/>
-        </w:rPr>
-      </w:pPr>
-      <w:r>
-        <w:rPr>
-          <w:lang w:val="en-US"/>
-        </w:rPr>
-        <w:t xml:space="preserve">Publica </w:t>
-      </w:r>
-      <w:proofErr w:type="spellStart"/>
-      <w:r>
-        <w:rPr>
-          <w:lang w:val="en-US"/>
-        </w:rPr>
-        <w:t>imágenes</w:t>
-      </w:r>
-      <w:proofErr w:type="spellEnd"/>
-      <w:r>
-        <w:rPr>
-          <w:lang w:val="en-US"/>
-        </w:rPr>
-        <w:t xml:space="preserve">: docker push </w:t>
-      </w:r>
-      <w:proofErr w:type="spellStart"/>
-      <w:r>
-        <w:rPr>
-          <w:lang w:val="en-US"/>
-        </w:rPr>
-        <w:t>tuusuario</w:t>
-      </w:r>
-      <w:proofErr w:type="spellEnd"/>
-      <w:r>
-        <w:rPr>
-          <w:lang w:val="en-US"/>
-        </w:rPr>
-        <w:t>/</w:t>
-      </w:r>
-      <w:proofErr w:type="spellStart"/>
-      <w:r>
-        <w:rPr>
-          <w:lang w:val="en-US"/>
-        </w:rPr>
-        <w:t>securevault-auth:latest</w:t>
-      </w:r>
-      <w:proofErr w:type="spellEnd"/>
+        <w:t>Publica imágenes: docker push tuusuario/securevault-auth:latest</w:t>
+      </w:r>
     </w:p>
     <w:p>
       <w:pPr>
@@ -5928,13 +4205,8 @@
           <w:numId w:val="16"/>
         </w:numPr>
       </w:pPr>
-      <w:proofErr w:type="spellStart"/>
-      <w:r>
-        <w:t>Trivy</w:t>
-      </w:r>
-      <w:proofErr w:type="spellEnd"/>
-      <w:r>
-        <w:t xml:space="preserve"> en imágenes Docker: [captura o resultados aquí]</w:t>
+      <w:r>
+        <w:t>Trivy en imágenes Docker: [captura o resultados aquí]</w:t>
       </w:r>
     </w:p>
     <w:p>
@@ -5944,27 +4216,9 @@
           <w:numId w:val="16"/>
         </w:numPr>
       </w:pPr>
-      <w:proofErr w:type="spellStart"/>
-      <w:r>
-        <w:t>Bandit</w:t>
-      </w:r>
-      <w:proofErr w:type="spellEnd"/>
-      <w:r>
-        <w:t xml:space="preserve"> (Python): 0 </w:t>
-      </w:r>
-      <w:proofErr w:type="spellStart"/>
-      <w:r>
-        <w:t>high</w:t>
-      </w:r>
-      <w:proofErr w:type="spellEnd"/>
-      <w:r>
-        <w:t xml:space="preserve"> </w:t>
-      </w:r>
-      <w:proofErr w:type="spellStart"/>
-      <w:r>
-        <w:t>issues</w:t>
-      </w:r>
-      <w:proofErr w:type="spellEnd"/>
+      <w:r>
+        <w:t>Bandit (Python): 0 high issues</w:t>
+      </w:r>
     </w:p>
     <w:p>
       <w:pPr>
@@ -8963,6 +7217,7 @@
   <w:style w:type="character" w:default="1" w:styleId="Fuentedeprrafopredeter">
     <w:name w:val="Default Paragraph Font"/>
     <w:uiPriority w:val="1"/>
+    <w:semiHidden/>
     <w:unhideWhenUsed/>
   </w:style>
   <w:style w:type="table" w:default="1" w:styleId="Tablanormal">

</xml_diff>